<commit_message>
A chart each reader draws above a list, behind a Chart button (#64)
chart_builder on a resource puts a Chart button in its table's toolbar,
opening a card above the list - closed until opened - where the reader
picks the form, the field to group by, a second one to split by, and
the count or the total or average of a number. It follows the table's
filters, a click filters the table, and the choices are remembered and
saved with the table's views. auto() resources have it, the fields
worked out; a ModelResource says True, a tuple of fields or
ChartBuilder(...). GET api/<app>/<model>/chart-builder/ accepts only
the offered keys. Docs, user guide in both languages and Word, French
catalogs, tests through the endpoint and the browser.

Claude-Session: https://claude.ai/code/session_018WAGXbpne2e2Q7SxWjcb92

Co-authored-by: Claude <noreply@anthropic.com>
</commit_message>
<xml_diff>
--- a/docs/user-guide/guide-utilisateur.docx
+++ b/docs/user-guide/guide-utilisateur.docx
@@ -1886,7 +1886,7 @@
         <w:pStyle w:val="Heading2"/>
       </w:pPr>
       <w:r>
-        <w:t>Les vues : retrouver une disposition</w:t>
+        <w:t>Dessiner son propre graphique</w:t>
       </w:r>
     </w:p>
     <w:p>
@@ -1897,7 +1897,7 @@
       <w:r>
         <w:drawing>
           <wp:inline xmlns:a="http://schemas.openxmlformats.org/drawingml/2006/main" xmlns:pic="http://schemas.openxmlformats.org/drawingml/2006/picture">
-            <wp:extent cx="5400000" cy="4285714"/>
+            <wp:extent cx="5400000" cy="3846429"/>
             <wp:docPr id="7" name="Picture 7"/>
             <wp:cNvGraphicFramePr>
               <a:graphicFrameLocks noChangeAspect="1"/>
@@ -1906,7 +1906,7 @@
               <a:graphicData uri="http://schemas.openxmlformats.org/drawingml/2006/picture">
                 <pic:pic>
                   <pic:nvPicPr>
-                    <pic:cNvPr id="0" name="05-vues.png"/>
+                    <pic:cNvPr id="0" name="23-graphique-libre.png"/>
                     <pic:cNvPicPr/>
                   </pic:nvPicPr>
                   <pic:blipFill>
@@ -1918,7 +1918,7 @@
                   <pic:spPr>
                     <a:xfrm>
                       <a:off x="0" y="0"/>
-                      <a:ext cx="5400000" cy="4285714"/>
+                      <a:ext cx="5400000" cy="3846429"/>
                     </a:xfrm>
                     <a:prstGeom prst="rect"/>
                   </pic:spPr>
@@ -1939,7 +1939,7 @@
           <w:color w:val="555B66"/>
           <w:sz w:val="18"/>
         </w:rPr>
-        <w:t>Le menu Vues.</w:t>
+        <w:t>Le graphique de la liste du matériel : le prix total par état, détaillé par fournisseur.</w:t>
       </w:r>
     </w:p>
     <w:p>
@@ -1948,91 +1948,35 @@
           <w:b w:val="0"/>
           <w:i w:val="0"/>
         </w:rPr>
-        <w:t xml:space="preserve">Le menu </w:t>
+        <w:t xml:space="preserve">Là où il est proposé, le bouton </w:t>
       </w:r>
       <w:r>
         <w:rPr>
           <w:b/>
           <w:i w:val="0"/>
         </w:rPr>
-        <w:t>Vues</w:t>
-      </w:r>
-      <w:r>
-        <w:rPr>
-          <w:b w:val="0"/>
-          <w:i w:val="0"/>
-        </w:rPr>
-        <w:t xml:space="preserve"> propose les </w:t>
-      </w:r>
-      <w:r>
-        <w:rPr>
-          <w:b w:val="0"/>
-          <w:i/>
-        </w:rPr>
-        <w:t>vues suggérées</w:t>
-      </w:r>
-      <w:r>
-        <w:rPr>
-          <w:b w:val="0"/>
-          <w:i w:val="0"/>
-        </w:rPr>
-        <w:t xml:space="preserve"> par l'application et </w:t>
-      </w:r>
-      <w:r>
-        <w:rPr>
-          <w:b w:val="0"/>
-          <w:i/>
-        </w:rPr>
-        <w:t>vos vues</w:t>
-      </w:r>
-      <w:r>
-        <w:rPr>
-          <w:b w:val="0"/>
-          <w:i w:val="0"/>
-        </w:rPr>
-        <w:t xml:space="preserve">. </w:t>
-      </w:r>
-      <w:r>
-        <w:rPr>
-          <w:b w:val="0"/>
-          <w:i/>
-        </w:rPr>
-        <w:t>Enregistrer cette vue</w:t>
-      </w:r>
-      <w:r>
-        <w:rPr>
-          <w:b w:val="0"/>
-          <w:i w:val="0"/>
-        </w:rPr>
-        <w:t xml:space="preserve"> mémorise la disposition actuelle (colonnes, ordre, tri, filtres, recherche, nombre de lignes) sous un nom ; une vue peut devenir celle qui s'ouvre par défaut, et elle vous suit sur tous vos appareils. </w:t>
-      </w:r>
-      <w:r>
-        <w:rPr>
-          <w:b w:val="0"/>
-          <w:i/>
-        </w:rPr>
-        <w:t>Revenir à la disposition par défaut</w:t>
-      </w:r>
-      <w:r>
-        <w:rPr>
-          <w:b w:val="0"/>
-          <w:i w:val="0"/>
-        </w:rPr>
-        <w:t xml:space="preserve"> efface tout ce qui a été changé. Lorsque l'application le permet, </w:t>
-      </w:r>
-      <w:r>
-        <w:rPr>
-          <w:b w:val="0"/>
-          <w:i/>
-        </w:rPr>
-        <w:t>Envoyer par e-mail selon un calendrier</w:t>
-      </w:r>
-      <w:r>
-        <w:rPr>
-          <w:b w:val="0"/>
-          <w:i w:val="0"/>
-        </w:rPr>
-        <w:t xml:space="preserve"> programme l'envoi régulier de la liste.</w:t>
+        <w:t>Graphique</w:t>
+      </w:r>
+      <w:r>
+        <w:rPr>
+          <w:b w:val="0"/>
+          <w:i w:val="0"/>
+        </w:rPr>
+        <w:t xml:space="preserve"> de la barre du tableau ouvre un graphique au-dessus de la liste ; il reste fermé tant qu'on ne l'ouvre pas. Choisissez sa forme (barres, lignes, aires, camembert, anneau, carte de chaleur), le champ qui regroupe les lignes, un second champ qui les détaille, et ce qui est affiché : le nombre de lignes, ou le total ou la moyenne d'un nombre. Une date se regroupe par jour, semaine, mois, trimestre ou année. Comme les autres graphiques, il suit les filtres du tableau, et un clic sur une barre filtre le tableau. Vos choix sont gardés pour la prochaine visite, et une vue enregistrée les garde aussi. Le </w:t>
+      </w:r>
+      <w:r>
+        <w:rPr>
+          <w:b/>
+          <w:i w:val="0"/>
+        </w:rPr>
+        <w:t>×</w:t>
+      </w:r>
+      <w:r>
+        <w:rPr>
+          <w:b w:val="0"/>
+          <w:i w:val="0"/>
+        </w:rPr>
+        <w:t xml:space="preserve"> du graphique, ou le bouton de nouveau, le ferme.</w:t>
       </w:r>
     </w:p>
     <w:p>
@@ -2040,7 +1984,7 @@
         <w:pStyle w:val="Heading2"/>
       </w:pPr>
       <w:r>
-        <w:t>Choisir les colonnes</w:t>
+        <w:t>Les vues : retrouver une disposition</w:t>
       </w:r>
     </w:p>
     <w:p>
@@ -2060,7 +2004,7 @@
               <a:graphicData uri="http://schemas.openxmlformats.org/drawingml/2006/picture">
                 <pic:pic>
                   <pic:nvPicPr>
-                    <pic:cNvPr id="0" name="06-colonnes.png"/>
+                    <pic:cNvPr id="0" name="05-vues.png"/>
                     <pic:cNvPicPr/>
                   </pic:nvPicPr>
                   <pic:blipFill>
@@ -2093,7 +2037,7 @@
           <w:color w:val="555B66"/>
           <w:sz w:val="18"/>
         </w:rPr>
-        <w:t>Le menu Colonnes.</w:t>
+        <w:t>Le menu Vues.</w:t>
       </w:r>
     </w:p>
     <w:p>
@@ -2109,42 +2053,84 @@
           <w:b/>
           <w:i w:val="0"/>
         </w:rPr>
-        <w:t>Colonnes</w:t>
-      </w:r>
-      <w:r>
-        <w:rPr>
-          <w:b w:val="0"/>
-          <w:i w:val="0"/>
-        </w:rPr>
-        <w:t xml:space="preserve"> coche ou décoche les colonnes affichées, avec une zone pour en trouver une par son nom ; </w:t>
+        <w:t>Vues</w:t>
+      </w:r>
+      <w:r>
+        <w:rPr>
+          <w:b w:val="0"/>
+          <w:i w:val="0"/>
+        </w:rPr>
+        <w:t xml:space="preserve"> propose les </w:t>
       </w:r>
       <w:r>
         <w:rPr>
           <w:b w:val="0"/>
           <w:i/>
         </w:rPr>
-        <w:t>Tout afficher</w:t>
-      </w:r>
-      <w:r>
-        <w:rPr>
-          <w:b w:val="0"/>
-          <w:i w:val="0"/>
-        </w:rPr>
-        <w:t xml:space="preserve"> et </w:t>
+        <w:t>vues suggérées</w:t>
+      </w:r>
+      <w:r>
+        <w:rPr>
+          <w:b w:val="0"/>
+          <w:i w:val="0"/>
+        </w:rPr>
+        <w:t xml:space="preserve"> par l'application et </w:t>
       </w:r>
       <w:r>
         <w:rPr>
           <w:b w:val="0"/>
           <w:i/>
         </w:rPr>
-        <w:t>Par défaut</w:t>
-      </w:r>
-      <w:r>
-        <w:rPr>
-          <w:b w:val="0"/>
-          <w:i w:val="0"/>
-        </w:rPr>
-        <w:t xml:space="preserve"> sont en bas du menu.</w:t>
+        <w:t>vos vues</w:t>
+      </w:r>
+      <w:r>
+        <w:rPr>
+          <w:b w:val="0"/>
+          <w:i w:val="0"/>
+        </w:rPr>
+        <w:t xml:space="preserve">. </w:t>
+      </w:r>
+      <w:r>
+        <w:rPr>
+          <w:b w:val="0"/>
+          <w:i/>
+        </w:rPr>
+        <w:t>Enregistrer cette vue</w:t>
+      </w:r>
+      <w:r>
+        <w:rPr>
+          <w:b w:val="0"/>
+          <w:i w:val="0"/>
+        </w:rPr>
+        <w:t xml:space="preserve"> mémorise la disposition actuelle (colonnes, ordre, tri, filtres, recherche, nombre de lignes) sous un nom ; une vue peut devenir celle qui s'ouvre par défaut, et elle vous suit sur tous vos appareils. </w:t>
+      </w:r>
+      <w:r>
+        <w:rPr>
+          <w:b w:val="0"/>
+          <w:i/>
+        </w:rPr>
+        <w:t>Revenir à la disposition par défaut</w:t>
+      </w:r>
+      <w:r>
+        <w:rPr>
+          <w:b w:val="0"/>
+          <w:i w:val="0"/>
+        </w:rPr>
+        <w:t xml:space="preserve"> efface tout ce qui a été changé. Lorsque l'application le permet, </w:t>
+      </w:r>
+      <w:r>
+        <w:rPr>
+          <w:b w:val="0"/>
+          <w:i/>
+        </w:rPr>
+        <w:t>Envoyer par e-mail selon un calendrier</w:t>
+      </w:r>
+      <w:r>
+        <w:rPr>
+          <w:b w:val="0"/>
+          <w:i w:val="0"/>
+        </w:rPr>
+        <w:t xml:space="preserve"> programme l'envoi régulier de la liste.</w:t>
       </w:r>
     </w:p>
     <w:p>
@@ -2152,7 +2138,7 @@
         <w:pStyle w:val="Heading2"/>
       </w:pPr>
       <w:r>
-        <w:t>Exporter</w:t>
+        <w:t>Choisir les colonnes</w:t>
       </w:r>
     </w:p>
     <w:p>
@@ -2172,7 +2158,7 @@
               <a:graphicData uri="http://schemas.openxmlformats.org/drawingml/2006/picture">
                 <pic:pic>
                   <pic:nvPicPr>
-                    <pic:cNvPr id="0" name="07-export.png"/>
+                    <pic:cNvPr id="0" name="06-colonnes.png"/>
                     <pic:cNvPicPr/>
                   </pic:nvPicPr>
                   <pic:blipFill>
@@ -2205,7 +2191,7 @@
           <w:color w:val="555B66"/>
           <w:sz w:val="18"/>
         </w:rPr>
-        <w:t>Le menu Exporter.</w:t>
+        <w:t>Le menu Colonnes.</w:t>
       </w:r>
     </w:p>
     <w:p>
@@ -2221,21 +2207,21 @@
           <w:b/>
           <w:i w:val="0"/>
         </w:rPr>
-        <w:t>Exporter</w:t>
-      </w:r>
-      <w:r>
-        <w:rPr>
-          <w:b w:val="0"/>
-          <w:i w:val="0"/>
-        </w:rPr>
-        <w:t xml:space="preserve"> propose </w:t>
+        <w:t>Colonnes</w:t>
+      </w:r>
+      <w:r>
+        <w:rPr>
+          <w:b w:val="0"/>
+          <w:i w:val="0"/>
+        </w:rPr>
+        <w:t xml:space="preserve"> coche ou décoche les colonnes affichées, avec une zone pour en trouver une par son nom ; </w:t>
       </w:r>
       <w:r>
         <w:rPr>
           <w:b w:val="0"/>
           <w:i/>
         </w:rPr>
-        <w:t>Excel</w:t>
+        <w:t>Tout afficher</w:t>
       </w:r>
       <w:r>
         <w:rPr>
@@ -2249,56 +2235,14 @@
           <w:b w:val="0"/>
           <w:i/>
         </w:rPr>
-        <w:t>CSV</w:t>
-      </w:r>
-      <w:r>
-        <w:rPr>
-          <w:b w:val="0"/>
-          <w:i w:val="0"/>
-        </w:rPr>
-        <w:t xml:space="preserve"> : le fichier contient </w:t>
-      </w:r>
-      <w:r>
-        <w:rPr>
-          <w:b/>
-          <w:i w:val="0"/>
-        </w:rPr>
-        <w:t>toutes les lignes qui correspondent aux filtres et à la recherche</w:t>
-      </w:r>
-      <w:r>
-        <w:rPr>
-          <w:b w:val="0"/>
-          <w:i w:val="0"/>
-        </w:rPr>
-        <w:t xml:space="preserve">, pas seulement la page affichée, avec les colonnes visibles dans leur ordre. </w:t>
-      </w:r>
-      <w:r>
-        <w:rPr>
-          <w:b w:val="0"/>
-          <w:i/>
-        </w:rPr>
-        <w:t>Copier dans le presse-papiers</w:t>
-      </w:r>
-      <w:r>
-        <w:rPr>
-          <w:b w:val="0"/>
-          <w:i w:val="0"/>
-        </w:rPr>
-        <w:t xml:space="preserve"> et </w:t>
-      </w:r>
-      <w:r>
-        <w:rPr>
-          <w:b w:val="0"/>
-          <w:i/>
-        </w:rPr>
-        <w:t>Imprimer</w:t>
-      </w:r>
-      <w:r>
-        <w:rPr>
-          <w:b w:val="0"/>
-          <w:i w:val="0"/>
-        </w:rPr>
-        <w:t xml:space="preserve"> ne prennent que la page affichée.</w:t>
+        <w:t>Par défaut</w:t>
+      </w:r>
+      <w:r>
+        <w:rPr>
+          <w:b w:val="0"/>
+          <w:i w:val="0"/>
+        </w:rPr>
+        <w:t xml:space="preserve"> sont en bas du menu.</w:t>
       </w:r>
     </w:p>
     <w:p>
@@ -2306,7 +2250,7 @@
         <w:pStyle w:val="Heading2"/>
       </w:pPr>
       <w:r>
-        <w:t>Agir sur plusieurs lignes</w:t>
+        <w:t>Exporter</w:t>
       </w:r>
     </w:p>
     <w:p>
@@ -2326,7 +2270,7 @@
               <a:graphicData uri="http://schemas.openxmlformats.org/drawingml/2006/picture">
                 <pic:pic>
                   <pic:nvPicPr>
-                    <pic:cNvPr id="0" name="08-selection.png"/>
+                    <pic:cNvPr id="0" name="07-export.png"/>
                     <pic:cNvPicPr/>
                   </pic:nvPicPr>
                   <pic:blipFill>
@@ -2359,113 +2303,100 @@
           <w:color w:val="555B66"/>
           <w:sz w:val="18"/>
         </w:rPr>
-        <w:t>Deux lignes sélectionnées et la barre des actions.</w:t>
+        <w:t>Le menu Exporter.</w:t>
       </w:r>
     </w:p>
     <w:p>
-      <w:pPr>
-        <w:ind w:left="539" w:hanging="283"/>
-      </w:pPr>
+      <w:r>
+        <w:rPr>
+          <w:b w:val="0"/>
+          <w:i w:val="0"/>
+        </w:rPr>
+        <w:t xml:space="preserve">Le menu </w:t>
+      </w:r>
       <w:r>
         <w:rPr>
           <w:b/>
           <w:i w:val="0"/>
         </w:rPr>
-        <w:t xml:space="preserve">1. </w:t>
-      </w:r>
-      <w:r>
-        <w:rPr>
-          <w:b w:val="0"/>
-          <w:i w:val="0"/>
-        </w:rPr>
-        <w:t xml:space="preserve">Cochez les lignes voulues. La case de l'en-tête coche toute la page ; un lien propose ensuite de </w:t>
+        <w:t>Exporter</w:t>
+      </w:r>
+      <w:r>
+        <w:rPr>
+          <w:b w:val="0"/>
+          <w:i w:val="0"/>
+        </w:rPr>
+        <w:t xml:space="preserve"> propose </w:t>
       </w:r>
       <w:r>
         <w:rPr>
           <w:b w:val="0"/>
           <w:i/>
         </w:rPr>
-        <w:t>Sélectionner les N lignes correspondantes</w:t>
-      </w:r>
-      <w:r>
-        <w:rPr>
-          <w:b w:val="0"/>
-          <w:i w:val="0"/>
-        </w:rPr>
-        <w:t>, c'est-à-dire toutes celles des filtres en cours.</w:t>
-      </w:r>
-    </w:p>
-    <w:p>
-      <w:pPr>
-        <w:ind w:left="539" w:hanging="283"/>
-      </w:pPr>
+        <w:t>Excel</w:t>
+      </w:r>
+      <w:r>
+        <w:rPr>
+          <w:b w:val="0"/>
+          <w:i w:val="0"/>
+        </w:rPr>
+        <w:t xml:space="preserve"> et </w:t>
+      </w:r>
+      <w:r>
+        <w:rPr>
+          <w:b w:val="0"/>
+          <w:i/>
+        </w:rPr>
+        <w:t>CSV</w:t>
+      </w:r>
+      <w:r>
+        <w:rPr>
+          <w:b w:val="0"/>
+          <w:i w:val="0"/>
+        </w:rPr>
+        <w:t xml:space="preserve"> : le fichier contient </w:t>
+      </w:r>
       <w:r>
         <w:rPr>
           <w:b/>
           <w:i w:val="0"/>
         </w:rPr>
-        <w:t xml:space="preserve">2. </w:t>
-      </w:r>
-      <w:r>
-        <w:rPr>
-          <w:b w:val="0"/>
-          <w:i w:val="0"/>
-        </w:rPr>
-        <w:t xml:space="preserve">Une barre apparaît : </w:t>
+        <w:t>toutes les lignes qui correspondent aux filtres et à la recherche</w:t>
+      </w:r>
+      <w:r>
+        <w:rPr>
+          <w:b w:val="0"/>
+          <w:i w:val="0"/>
+        </w:rPr>
+        <w:t xml:space="preserve">, pas seulement la page affichée, avec les colonnes visibles dans leur ordre. </w:t>
       </w:r>
       <w:r>
         <w:rPr>
           <w:b w:val="0"/>
           <w:i/>
         </w:rPr>
-        <w:t>Choisir une action…</w:t>
-      </w:r>
-      <w:r>
-        <w:rPr>
-          <w:b w:val="0"/>
-          <w:i w:val="0"/>
-        </w:rPr>
-        <w:t xml:space="preserve">, puis </w:t>
+        <w:t>Copier dans le presse-papiers</w:t>
+      </w:r>
+      <w:r>
+        <w:rPr>
+          <w:b w:val="0"/>
+          <w:i w:val="0"/>
+        </w:rPr>
+        <w:t xml:space="preserve"> et </w:t>
       </w:r>
       <w:r>
         <w:rPr>
           <w:b w:val="0"/>
           <w:i/>
         </w:rPr>
-        <w:t>Appliquer</w:t>
-      </w:r>
-      <w:r>
-        <w:rPr>
-          <w:b w:val="0"/>
-          <w:i w:val="0"/>
-        </w:rPr>
-        <w:t>. Les actions dangereuses demandent une confirmation.</w:t>
-      </w:r>
-    </w:p>
-    <w:p>
-      <w:pPr>
-        <w:ind w:left="539" w:hanging="283"/>
-      </w:pPr>
-      <w:r>
-        <w:rPr>
-          <w:b/>
-          <w:i w:val="0"/>
-        </w:rPr>
-        <w:t xml:space="preserve">3. </w:t>
-      </w:r>
-      <w:r>
-        <w:rPr>
-          <w:b w:val="0"/>
-          <w:i/>
-        </w:rPr>
-        <w:t>Effacer la sélection</w:t>
-      </w:r>
-      <w:r>
-        <w:rPr>
-          <w:b w:val="0"/>
-          <w:i w:val="0"/>
-        </w:rPr>
-        <w:t xml:space="preserve"> décoche tout.</w:t>
+        <w:t>Imprimer</w:t>
+      </w:r>
+      <w:r>
+        <w:rPr>
+          <w:b w:val="0"/>
+          <w:i w:val="0"/>
+        </w:rPr>
+        <w:t xml:space="preserve"> ne prennent que la page affichée.</w:t>
       </w:r>
     </w:p>
     <w:p>
@@ -2473,7 +2404,7 @@
         <w:pStyle w:val="Heading2"/>
       </w:pPr>
       <w:r>
-        <w:t>Modifier plusieurs enregistrements à la fois</w:t>
+        <w:t>Agir sur plusieurs lignes</w:t>
       </w:r>
     </w:p>
     <w:p>
@@ -2484,8 +2415,175 @@
       <w:r>
         <w:drawing>
           <wp:inline xmlns:a="http://schemas.openxmlformats.org/drawingml/2006/main" xmlns:pic="http://schemas.openxmlformats.org/drawingml/2006/picture">
+            <wp:extent cx="5400000" cy="4285714"/>
+            <wp:docPr id="11" name="Picture 11"/>
+            <wp:cNvGraphicFramePr>
+              <a:graphicFrameLocks noChangeAspect="1"/>
+            </wp:cNvGraphicFramePr>
+            <a:graphic>
+              <a:graphicData uri="http://schemas.openxmlformats.org/drawingml/2006/picture">
+                <pic:pic>
+                  <pic:nvPicPr>
+                    <pic:cNvPr id="0" name="08-selection.png"/>
+                    <pic:cNvPicPr/>
+                  </pic:nvPicPr>
+                  <pic:blipFill>
+                    <a:blip r:embed="rId20"/>
+                    <a:stretch>
+                      <a:fillRect/>
+                    </a:stretch>
+                  </pic:blipFill>
+                  <pic:spPr>
+                    <a:xfrm>
+                      <a:off x="0" y="0"/>
+                      <a:ext cx="5400000" cy="4285714"/>
+                    </a:xfrm>
+                    <a:prstGeom prst="rect"/>
+                  </pic:spPr>
+                </pic:pic>
+              </a:graphicData>
+            </a:graphic>
+          </wp:inline>
+        </w:drawing>
+      </w:r>
+    </w:p>
+    <w:p>
+      <w:pPr>
+        <w:jc w:val="center"/>
+      </w:pPr>
+      <w:r>
+        <w:rPr>
+          <w:i/>
+          <w:color w:val="555B66"/>
+          <w:sz w:val="18"/>
+        </w:rPr>
+        <w:t>Deux lignes sélectionnées et la barre des actions.</w:t>
+      </w:r>
+    </w:p>
+    <w:p>
+      <w:pPr>
+        <w:ind w:left="539" w:hanging="283"/>
+      </w:pPr>
+      <w:r>
+        <w:rPr>
+          <w:b/>
+          <w:i w:val="0"/>
+        </w:rPr>
+        <w:t xml:space="preserve">1. </w:t>
+      </w:r>
+      <w:r>
+        <w:rPr>
+          <w:b w:val="0"/>
+          <w:i w:val="0"/>
+        </w:rPr>
+        <w:t xml:space="preserve">Cochez les lignes voulues. La case de l'en-tête coche toute la page ; un lien propose ensuite de </w:t>
+      </w:r>
+      <w:r>
+        <w:rPr>
+          <w:b w:val="0"/>
+          <w:i/>
+        </w:rPr>
+        <w:t>Sélectionner les N lignes correspondantes</w:t>
+      </w:r>
+      <w:r>
+        <w:rPr>
+          <w:b w:val="0"/>
+          <w:i w:val="0"/>
+        </w:rPr>
+        <w:t>, c'est-à-dire toutes celles des filtres en cours.</w:t>
+      </w:r>
+    </w:p>
+    <w:p>
+      <w:pPr>
+        <w:ind w:left="539" w:hanging="283"/>
+      </w:pPr>
+      <w:r>
+        <w:rPr>
+          <w:b/>
+          <w:i w:val="0"/>
+        </w:rPr>
+        <w:t xml:space="preserve">2. </w:t>
+      </w:r>
+      <w:r>
+        <w:rPr>
+          <w:b w:val="0"/>
+          <w:i w:val="0"/>
+        </w:rPr>
+        <w:t xml:space="preserve">Une barre apparaît : </w:t>
+      </w:r>
+      <w:r>
+        <w:rPr>
+          <w:b w:val="0"/>
+          <w:i/>
+        </w:rPr>
+        <w:t>Choisir une action…</w:t>
+      </w:r>
+      <w:r>
+        <w:rPr>
+          <w:b w:val="0"/>
+          <w:i w:val="0"/>
+        </w:rPr>
+        <w:t xml:space="preserve">, puis </w:t>
+      </w:r>
+      <w:r>
+        <w:rPr>
+          <w:b w:val="0"/>
+          <w:i/>
+        </w:rPr>
+        <w:t>Appliquer</w:t>
+      </w:r>
+      <w:r>
+        <w:rPr>
+          <w:b w:val="0"/>
+          <w:i w:val="0"/>
+        </w:rPr>
+        <w:t>. Les actions dangereuses demandent une confirmation.</w:t>
+      </w:r>
+    </w:p>
+    <w:p>
+      <w:pPr>
+        <w:ind w:left="539" w:hanging="283"/>
+      </w:pPr>
+      <w:r>
+        <w:rPr>
+          <w:b/>
+          <w:i w:val="0"/>
+        </w:rPr>
+        <w:t xml:space="preserve">3. </w:t>
+      </w:r>
+      <w:r>
+        <w:rPr>
+          <w:b w:val="0"/>
+          <w:i/>
+        </w:rPr>
+        <w:t>Effacer la sélection</w:t>
+      </w:r>
+      <w:r>
+        <w:rPr>
+          <w:b w:val="0"/>
+          <w:i w:val="0"/>
+        </w:rPr>
+        <w:t xml:space="preserve"> décoche tout.</w:t>
+      </w:r>
+    </w:p>
+    <w:p>
+      <w:pPr>
+        <w:pStyle w:val="Heading2"/>
+      </w:pPr>
+      <w:r>
+        <w:t>Modifier plusieurs enregistrements à la fois</w:t>
+      </w:r>
+    </w:p>
+    <w:p>
+      <w:pPr>
+        <w:keepNext/>
+        <w:jc w:val="center"/>
+      </w:pPr>
+      <w:r>
+        <w:drawing>
+          <wp:inline xmlns:a="http://schemas.openxmlformats.org/drawingml/2006/main" xmlns:pic="http://schemas.openxmlformats.org/drawingml/2006/picture">
             <wp:extent cx="5400000" cy="3846429"/>
-            <wp:docPr id="11" name="Picture 11"/>
+            <wp:docPr id="12" name="Picture 12"/>
             <wp:cNvGraphicFramePr>
               <a:graphicFrameLocks noChangeAspect="1"/>
             </wp:cNvGraphicFramePr>
@@ -2497,7 +2595,7 @@
                     <pic:cNvPicPr/>
                   </pic:nvPicPr>
                   <pic:blipFill>
-                    <a:blip r:embed="rId20"/>
+                    <a:blip r:embed="rId21"/>
                     <a:stretch>
                       <a:fillRect/>
                     </a:stretch>
@@ -2681,7 +2779,7 @@
         <w:drawing>
           <wp:inline xmlns:a="http://schemas.openxmlformats.org/drawingml/2006/main" xmlns:pic="http://schemas.openxmlformats.org/drawingml/2006/picture">
             <wp:extent cx="5400000" cy="4285714"/>
-            <wp:docPr id="12" name="Picture 12"/>
+            <wp:docPr id="13" name="Picture 13"/>
             <wp:cNvGraphicFramePr>
               <a:graphicFrameLocks noChangeAspect="1"/>
             </wp:cNvGraphicFramePr>
@@ -2690,219 +2788,6 @@
                 <pic:pic>
                   <pic:nvPicPr>
                     <pic:cNvPr id="0" name="09-menu-ligne.png"/>
-                    <pic:cNvPicPr/>
-                  </pic:nvPicPr>
-                  <pic:blipFill>
-                    <a:blip r:embed="rId21"/>
-                    <a:stretch>
-                      <a:fillRect/>
-                    </a:stretch>
-                  </pic:blipFill>
-                  <pic:spPr>
-                    <a:xfrm>
-                      <a:off x="0" y="0"/>
-                      <a:ext cx="5400000" cy="4285714"/>
-                    </a:xfrm>
-                    <a:prstGeom prst="rect"/>
-                  </pic:spPr>
-                </pic:pic>
-              </a:graphicData>
-            </a:graphic>
-          </wp:inline>
-        </w:drawing>
-      </w:r>
-    </w:p>
-    <w:p>
-      <w:pPr>
-        <w:jc w:val="center"/>
-      </w:pPr>
-      <w:r>
-        <w:rPr>
-          <w:i/>
-          <w:color w:val="555B66"/>
-          <w:sz w:val="18"/>
-        </w:rPr>
-        <w:t>Le menu d'une ligne, ouvert d'un clic droit.</w:t>
-      </w:r>
-    </w:p>
-    <w:p>
-      <w:r>
-        <w:rPr>
-          <w:b w:val="0"/>
-          <w:i w:val="0"/>
-        </w:rPr>
-        <w:t xml:space="preserve">Le bouton </w:t>
-      </w:r>
-      <w:r>
-        <w:rPr>
-          <w:b/>
-          <w:i w:val="0"/>
-        </w:rPr>
-        <w:t>⋯</w:t>
-      </w:r>
-      <w:r>
-        <w:rPr>
-          <w:b w:val="0"/>
-          <w:i w:val="0"/>
-        </w:rPr>
-        <w:t xml:space="preserve"> en bout de ligne, ou un </w:t>
-      </w:r>
-      <w:r>
-        <w:rPr>
-          <w:b/>
-          <w:i w:val="0"/>
-        </w:rPr>
-        <w:t>clic droit</w:t>
-      </w:r>
-      <w:r>
-        <w:rPr>
-          <w:b w:val="0"/>
-          <w:i w:val="0"/>
-        </w:rPr>
-        <w:t xml:space="preserve"> sur la ligne, ouvre son menu : </w:t>
-      </w:r>
-      <w:r>
-        <w:rPr>
-          <w:b w:val="0"/>
-          <w:i/>
-        </w:rPr>
-        <w:t>Ouvrir</w:t>
-      </w:r>
-      <w:r>
-        <w:rPr>
-          <w:b w:val="0"/>
-          <w:i w:val="0"/>
-        </w:rPr>
-        <w:t xml:space="preserve">, </w:t>
-      </w:r>
-      <w:r>
-        <w:rPr>
-          <w:b w:val="0"/>
-          <w:i/>
-        </w:rPr>
-        <w:t>Modifier</w:t>
-      </w:r>
-      <w:r>
-        <w:rPr>
-          <w:b w:val="0"/>
-          <w:i w:val="0"/>
-        </w:rPr>
-        <w:t xml:space="preserve">, </w:t>
-      </w:r>
-      <w:r>
-        <w:rPr>
-          <w:b w:val="0"/>
-          <w:i/>
-        </w:rPr>
-        <w:t>Supprimer</w:t>
-      </w:r>
-      <w:r>
-        <w:rPr>
-          <w:b w:val="0"/>
-          <w:i w:val="0"/>
-        </w:rPr>
-        <w:t xml:space="preserve"> et les autres actions permises, ainsi que les filtres sur la valeur cliquée. Un </w:t>
-      </w:r>
-      <w:r>
-        <w:rPr>
-          <w:b/>
-          <w:i w:val="0"/>
-        </w:rPr>
-        <w:t>double-clic</w:t>
-      </w:r>
-      <w:r>
-        <w:rPr>
-          <w:b w:val="0"/>
-          <w:i w:val="0"/>
-        </w:rPr>
-        <w:t xml:space="preserve"> sur une ligne ouvre l'enregistrement.</w:t>
-      </w:r>
-    </w:p>
-    <w:p>
-      <w:pPr>
-        <w:pStyle w:val="Heading2"/>
-      </w:pPr>
-      <w:r>
-        <w:t>Modifier directement dans un tableau</w:t>
-      </w:r>
-    </w:p>
-    <w:p>
-      <w:r>
-        <w:rPr>
-          <w:b w:val="0"/>
-          <w:i w:val="0"/>
-        </w:rPr>
-        <w:t xml:space="preserve">Certains tableaux sont des grilles de saisie : chaque cellule modifiable est déjà un champ. Une liste, une case ou une date s'enregistre aussitôt ; un texte s'enregistre avec </w:t>
-      </w:r>
-      <w:r>
-        <w:rPr>
-          <w:b/>
-          <w:i w:val="0"/>
-        </w:rPr>
-        <w:t>Entrée</w:t>
-      </w:r>
-      <w:r>
-        <w:rPr>
-          <w:b w:val="0"/>
-          <w:i w:val="0"/>
-        </w:rPr>
-        <w:t xml:space="preserve"> (le curseur descend d'une ligne, comme dans un tableur) ou en quittant la cellule ; </w:t>
-      </w:r>
-      <w:r>
-        <w:rPr>
-          <w:b/>
-          <w:i w:val="0"/>
-        </w:rPr>
-        <w:t>Échap</w:t>
-      </w:r>
-      <w:r>
-        <w:rPr>
-          <w:b w:val="0"/>
-          <w:i w:val="0"/>
-        </w:rPr>
-        <w:t xml:space="preserve"> annule la saisie. La cellule enregistrée s'éclaire en vert ; une erreur s'affiche sous la cellule. </w:t>
-      </w:r>
-      <w:r>
-        <w:rPr>
-          <w:b w:val="0"/>
-          <w:i/>
-        </w:rPr>
-        <w:t>Ajouter une ligne</w:t>
-      </w:r>
-      <w:r>
-        <w:rPr>
-          <w:b w:val="0"/>
-          <w:i w:val="0"/>
-        </w:rPr>
-        <w:t xml:space="preserve"> crée une ligne en haut du tableau, envoyée avec ✓ ou Entrée, abandonnée avec ✕.</w:t>
-      </w:r>
-    </w:p>
-    <w:p>
-      <w:pPr>
-        <w:pStyle w:val="Heading1"/>
-      </w:pPr>
-      <w:r>
-        <w:t>5. La fiche d'un enregistrement</w:t>
-      </w:r>
-    </w:p>
-    <w:p>
-      <w:pPr>
-        <w:keepNext/>
-        <w:jc w:val="center"/>
-      </w:pPr>
-      <w:r>
-        <w:drawing>
-          <wp:inline xmlns:a="http://schemas.openxmlformats.org/drawingml/2006/main" xmlns:pic="http://schemas.openxmlformats.org/drawingml/2006/picture">
-            <wp:extent cx="5400000" cy="4285714"/>
-            <wp:docPr id="13" name="Picture 13"/>
-            <wp:cNvGraphicFramePr>
-              <a:graphicFrameLocks noChangeAspect="1"/>
-            </wp:cNvGraphicFramePr>
-            <a:graphic>
-              <a:graphicData uri="http://schemas.openxmlformats.org/drawingml/2006/picture">
-                <pic:pic>
-                  <pic:nvPicPr>
-                    <pic:cNvPr id="0" name="12-fiche.png"/>
                     <pic:cNvPicPr/>
                   </pic:nvPicPr>
                   <pic:blipFill>
@@ -2935,7 +2820,167 @@
           <w:color w:val="555B66"/>
           <w:sz w:val="18"/>
         </w:rPr>
-        <w:t>La fiche d'un enregistrement : actions, chiffres, graphiques.</w:t>
+        <w:t>Le menu d'une ligne, ouvert d'un clic droit.</w:t>
+      </w:r>
+    </w:p>
+    <w:p>
+      <w:r>
+        <w:rPr>
+          <w:b w:val="0"/>
+          <w:i w:val="0"/>
+        </w:rPr>
+        <w:t xml:space="preserve">Le bouton </w:t>
+      </w:r>
+      <w:r>
+        <w:rPr>
+          <w:b/>
+          <w:i w:val="0"/>
+        </w:rPr>
+        <w:t>⋯</w:t>
+      </w:r>
+      <w:r>
+        <w:rPr>
+          <w:b w:val="0"/>
+          <w:i w:val="0"/>
+        </w:rPr>
+        <w:t xml:space="preserve"> en bout de ligne, ou un </w:t>
+      </w:r>
+      <w:r>
+        <w:rPr>
+          <w:b/>
+          <w:i w:val="0"/>
+        </w:rPr>
+        <w:t>clic droit</w:t>
+      </w:r>
+      <w:r>
+        <w:rPr>
+          <w:b w:val="0"/>
+          <w:i w:val="0"/>
+        </w:rPr>
+        <w:t xml:space="preserve"> sur la ligne, ouvre son menu : </w:t>
+      </w:r>
+      <w:r>
+        <w:rPr>
+          <w:b w:val="0"/>
+          <w:i/>
+        </w:rPr>
+        <w:t>Ouvrir</w:t>
+      </w:r>
+      <w:r>
+        <w:rPr>
+          <w:b w:val="0"/>
+          <w:i w:val="0"/>
+        </w:rPr>
+        <w:t xml:space="preserve">, </w:t>
+      </w:r>
+      <w:r>
+        <w:rPr>
+          <w:b w:val="0"/>
+          <w:i/>
+        </w:rPr>
+        <w:t>Modifier</w:t>
+      </w:r>
+      <w:r>
+        <w:rPr>
+          <w:b w:val="0"/>
+          <w:i w:val="0"/>
+        </w:rPr>
+        <w:t xml:space="preserve">, </w:t>
+      </w:r>
+      <w:r>
+        <w:rPr>
+          <w:b w:val="0"/>
+          <w:i/>
+        </w:rPr>
+        <w:t>Supprimer</w:t>
+      </w:r>
+      <w:r>
+        <w:rPr>
+          <w:b w:val="0"/>
+          <w:i w:val="0"/>
+        </w:rPr>
+        <w:t xml:space="preserve"> et les autres actions permises, ainsi que les filtres sur la valeur cliquée. Un </w:t>
+      </w:r>
+      <w:r>
+        <w:rPr>
+          <w:b/>
+          <w:i w:val="0"/>
+        </w:rPr>
+        <w:t>double-clic</w:t>
+      </w:r>
+      <w:r>
+        <w:rPr>
+          <w:b w:val="0"/>
+          <w:i w:val="0"/>
+        </w:rPr>
+        <w:t xml:space="preserve"> sur une ligne ouvre l'enregistrement.</w:t>
+      </w:r>
+    </w:p>
+    <w:p>
+      <w:pPr>
+        <w:pStyle w:val="Heading2"/>
+      </w:pPr>
+      <w:r>
+        <w:t>Modifier directement dans un tableau</w:t>
+      </w:r>
+    </w:p>
+    <w:p>
+      <w:r>
+        <w:rPr>
+          <w:b w:val="0"/>
+          <w:i w:val="0"/>
+        </w:rPr>
+        <w:t xml:space="preserve">Certains tableaux sont des grilles de saisie : chaque cellule modifiable est déjà un champ. Une liste, une case ou une date s'enregistre aussitôt ; un texte s'enregistre avec </w:t>
+      </w:r>
+      <w:r>
+        <w:rPr>
+          <w:b/>
+          <w:i w:val="0"/>
+        </w:rPr>
+        <w:t>Entrée</w:t>
+      </w:r>
+      <w:r>
+        <w:rPr>
+          <w:b w:val="0"/>
+          <w:i w:val="0"/>
+        </w:rPr>
+        <w:t xml:space="preserve"> (le curseur descend d'une ligne, comme dans un tableur) ou en quittant la cellule ; </w:t>
+      </w:r>
+      <w:r>
+        <w:rPr>
+          <w:b/>
+          <w:i w:val="0"/>
+        </w:rPr>
+        <w:t>Échap</w:t>
+      </w:r>
+      <w:r>
+        <w:rPr>
+          <w:b w:val="0"/>
+          <w:i w:val="0"/>
+        </w:rPr>
+        <w:t xml:space="preserve"> annule la saisie. La cellule enregistrée s'éclaire en vert ; une erreur s'affiche sous la cellule. </w:t>
+      </w:r>
+      <w:r>
+        <w:rPr>
+          <w:b w:val="0"/>
+          <w:i/>
+        </w:rPr>
+        <w:t>Ajouter une ligne</w:t>
+      </w:r>
+      <w:r>
+        <w:rPr>
+          <w:b w:val="0"/>
+          <w:i w:val="0"/>
+        </w:rPr>
+        <w:t xml:space="preserve"> crée une ligne en haut du tableau, envoyée avec ✓ ou Entrée, abandonnée avec ✕.</w:t>
+      </w:r>
+    </w:p>
+    <w:p>
+      <w:pPr>
+        <w:pStyle w:val="Heading1"/>
+      </w:pPr>
+      <w:r>
+        <w:t>5. La fiche d'un enregistrement</w:t>
       </w:r>
     </w:p>
     <w:p>
@@ -2955,7 +3000,7 @@
               <a:graphicData uri="http://schemas.openxmlformats.org/drawingml/2006/picture">
                 <pic:pic>
                   <pic:nvPicPr>
-                    <pic:cNvPr id="0" name="13-fiche-onglets.png"/>
+                    <pic:cNvPr id="0" name="12-fiche.png"/>
                     <pic:cNvPicPr/>
                   </pic:nvPicPr>
                   <pic:blipFill>
@@ -2988,300 +3033,7 @@
           <w:color w:val="555B66"/>
           <w:sz w:val="18"/>
         </w:rPr>
-        <w:t>Ses valeurs et les onglets des enregistrements liés.</w:t>
-      </w:r>
-    </w:p>
-    <w:p>
-      <w:r>
-        <w:rPr>
-          <w:b w:val="0"/>
-          <w:i w:val="0"/>
-        </w:rPr>
-        <w:t xml:space="preserve">Un clic sur un enregistrement ouvre sa </w:t>
-      </w:r>
-      <w:r>
-        <w:rPr>
-          <w:b/>
-          <w:i w:val="0"/>
-        </w:rPr>
-        <w:t>fiche</w:t>
-      </w:r>
-      <w:r>
-        <w:rPr>
-          <w:b w:val="0"/>
-          <w:i w:val="0"/>
-        </w:rPr>
-        <w:t xml:space="preserve"> (son résumé) :</w:t>
-      </w:r>
-    </w:p>
-    <w:p>
-      <w:pPr>
-        <w:pStyle w:val="ListBullet"/>
-      </w:pPr>
-      <w:r>
-        <w:rPr>
-          <w:b w:val="0"/>
-          <w:i w:val="0"/>
-        </w:rPr>
-        <w:t xml:space="preserve">en haut, son nom, les boutons </w:t>
-      </w:r>
-      <w:r>
-        <w:rPr>
-          <w:b w:val="0"/>
-          <w:i/>
-        </w:rPr>
-        <w:t>Suivre</w:t>
-      </w:r>
-      <w:r>
-        <w:rPr>
-          <w:b w:val="0"/>
-          <w:i w:val="0"/>
-        </w:rPr>
-        <w:t xml:space="preserve">, </w:t>
-      </w:r>
-      <w:r>
-        <w:rPr>
-          <w:b w:val="0"/>
-          <w:i/>
-        </w:rPr>
-        <w:t>Modifier</w:t>
-      </w:r>
-      <w:r>
-        <w:rPr>
-          <w:b w:val="0"/>
-          <w:i w:val="0"/>
-        </w:rPr>
-        <w:t xml:space="preserve">, le menu </w:t>
-      </w:r>
-      <w:r>
-        <w:rPr>
-          <w:b/>
-          <w:i w:val="0"/>
-        </w:rPr>
-        <w:t>⋯</w:t>
-      </w:r>
-      <w:r>
-        <w:rPr>
-          <w:b w:val="0"/>
-          <w:i w:val="0"/>
-        </w:rPr>
-        <w:t xml:space="preserve"> (</w:t>
-      </w:r>
-      <w:r>
-        <w:rPr>
-          <w:b w:val="0"/>
-          <w:i/>
-        </w:rPr>
-        <w:t>Plus d'actions</w:t>
-      </w:r>
-      <w:r>
-        <w:rPr>
-          <w:b w:val="0"/>
-          <w:i w:val="0"/>
-        </w:rPr>
-        <w:t>) et les actions propres à ce type d'enregistrement (changer un statut, par exemple) ;</w:t>
-      </w:r>
-    </w:p>
-    <w:p>
-      <w:pPr>
-        <w:pStyle w:val="ListBullet"/>
-      </w:pPr>
-      <w:r>
-        <w:rPr>
-          <w:b w:val="0"/>
-          <w:i w:val="0"/>
-        </w:rPr>
-        <w:t xml:space="preserve">une ligne indique qui l'a modifié en dernier, et quand, avec un lien </w:t>
-      </w:r>
-      <w:r>
-        <w:rPr>
-          <w:b w:val="0"/>
-          <w:i/>
-        </w:rPr>
-        <w:t>Voir l'historique</w:t>
-      </w:r>
-      <w:r>
-        <w:rPr>
-          <w:b w:val="0"/>
-          <w:i w:val="0"/>
-        </w:rPr>
-        <w:t xml:space="preserve"> ;</w:t>
-      </w:r>
-    </w:p>
-    <w:p>
-      <w:pPr>
-        <w:pStyle w:val="ListBullet"/>
-      </w:pPr>
-      <w:r>
-        <w:rPr>
-          <w:b w:val="0"/>
-          <w:i w:val="0"/>
-        </w:rPr>
-        <w:t xml:space="preserve">des </w:t>
-      </w:r>
-      <w:r>
-        <w:rPr>
-          <w:b/>
-          <w:i w:val="0"/>
-        </w:rPr>
-        <w:t>chiffres</w:t>
-      </w:r>
-      <w:r>
-        <w:rPr>
-          <w:b w:val="0"/>
-          <w:i w:val="0"/>
-        </w:rPr>
-        <w:t xml:space="preserve"> en tuiles et, parfois, des graphiques ;</w:t>
-      </w:r>
-    </w:p>
-    <w:p>
-      <w:pPr>
-        <w:pStyle w:val="ListBullet"/>
-      </w:pPr>
-      <w:r>
-        <w:rPr>
-          <w:b w:val="0"/>
-          <w:i w:val="0"/>
-        </w:rPr>
-        <w:t>ses valeurs, rangées par sections que l'on peut replier ; un enregistrement lié est un lien vers sa propre fiche, un fichier joint se télécharge d'un clic ;</w:t>
-      </w:r>
-    </w:p>
-    <w:p>
-      <w:pPr>
-        <w:pStyle w:val="ListBullet"/>
-      </w:pPr>
-      <w:r>
-        <w:rPr>
-          <w:b w:val="0"/>
-          <w:i w:val="0"/>
-        </w:rPr>
-        <w:t xml:space="preserve">des </w:t>
-      </w:r>
-      <w:r>
-        <w:rPr>
-          <w:b/>
-          <w:i w:val="0"/>
-        </w:rPr>
-        <w:t>onglets</w:t>
-      </w:r>
-      <w:r>
-        <w:rPr>
-          <w:b w:val="0"/>
-          <w:i w:val="0"/>
-        </w:rPr>
-        <w:t xml:space="preserve">, un par type d'enregistrement lié (les tickets d'un client, les saisies de temps d'un ticket…), avec leur nombre. Chaque onglet est une liste complète : recherche, filtres, vues, export, actions. Son bouton </w:t>
-      </w:r>
-      <w:r>
-        <w:rPr>
-          <w:b w:val="0"/>
-          <w:i/>
-        </w:rPr>
-        <w:t>Ajouter</w:t>
-      </w:r>
-      <w:r>
-        <w:rPr>
-          <w:b w:val="0"/>
-          <w:i w:val="0"/>
-        </w:rPr>
-        <w:t xml:space="preserve"> crée un enregistrement déjà rattaché à la fiche. Quand les onglets ne tiennent pas sur la largeur, les derniers passent derrière un bouton </w:t>
-      </w:r>
-      <w:r>
-        <w:rPr>
-          <w:b/>
-          <w:i w:val="0"/>
-        </w:rPr>
-        <w:t>+N</w:t>
-      </w:r>
-      <w:r>
-        <w:rPr>
-          <w:b w:val="0"/>
-          <w:i w:val="0"/>
-        </w:rPr>
-        <w:t>.</w:t>
-      </w:r>
-    </w:p>
-    <w:p>
-      <w:r>
-        <w:rPr>
-          <w:b w:val="0"/>
-          <w:i w:val="0"/>
-        </w:rPr>
-        <w:t>La fiche se met à jour d'elle-même si quelqu'un modifie l'enregistrement pendant que vous la regardez.</w:t>
-      </w:r>
-    </w:p>
-    <w:p>
-      <w:pPr>
-        <w:pStyle w:val="Heading1"/>
-      </w:pPr>
-      <w:r>
-        <w:t>6. Créer, modifier, supprimer</w:t>
-      </w:r>
-    </w:p>
-    <w:p>
-      <w:pPr>
-        <w:pStyle w:val="Heading2"/>
-      </w:pPr>
-      <w:r>
-        <w:t>Créer</w:t>
-      </w:r>
-    </w:p>
-    <w:p>
-      <w:r>
-        <w:rPr>
-          <w:b w:val="0"/>
-          <w:i w:val="0"/>
-        </w:rPr>
-        <w:t xml:space="preserve">Le bouton </w:t>
-      </w:r>
-      <w:r>
-        <w:rPr>
-          <w:b/>
-          <w:i w:val="0"/>
-        </w:rPr>
-        <w:t>Ajouter</w:t>
-      </w:r>
-      <w:r>
-        <w:rPr>
-          <w:b w:val="0"/>
-          <w:i w:val="0"/>
-        </w:rPr>
-        <w:t xml:space="preserve"> en haut d'une liste, un raccourci du tableau de bord, ou </w:t>
-      </w:r>
-      <w:r>
-        <w:rPr>
-          <w:b w:val="0"/>
-          <w:i/>
-        </w:rPr>
-        <w:t>Ajouter</w:t>
-      </w:r>
-      <w:r>
-        <w:rPr>
-          <w:b w:val="0"/>
-          <w:i w:val="0"/>
-        </w:rPr>
-        <w:t xml:space="preserve"> dans un onglet de fiche ouvrent un formulaire vide (dans le dernier cas, déjà rattaché à la fiche). Dans une vue calendrier, le </w:t>
-      </w:r>
-      <w:r>
-        <w:rPr>
-          <w:b/>
-          <w:i w:val="0"/>
-        </w:rPr>
-        <w:t>+</w:t>
-      </w:r>
-      <w:r>
-        <w:rPr>
-          <w:b w:val="0"/>
-          <w:i w:val="0"/>
-        </w:rPr>
-        <w:t xml:space="preserve"> d'un jour ouvre le formulaire avec cette date.</w:t>
-      </w:r>
-    </w:p>
-    <w:p>
-      <w:pPr>
-        <w:pStyle w:val="Heading2"/>
-      </w:pPr>
-      <w:r>
-        <w:t>Remplir un formulaire</w:t>
+        <w:t>La fiche d'un enregistrement : actions, chiffres, graphiques.</w:t>
       </w:r>
     </w:p>
     <w:p>
@@ -3301,7 +3053,7 @@
               <a:graphicData uri="http://schemas.openxmlformats.org/drawingml/2006/picture">
                 <pic:pic>
                   <pic:nvPicPr>
-                    <pic:cNvPr id="0" name="15-formulaire.png"/>
+                    <pic:cNvPr id="0" name="13-fiche-onglets.png"/>
                     <pic:cNvPicPr/>
                   </pic:nvPicPr>
                   <pic:blipFill>
@@ -3334,7 +3086,30 @@
           <w:color w:val="555B66"/>
           <w:sz w:val="18"/>
         </w:rPr>
-        <w:t>Un formulaire et ses boutons d'enregistrement.</w:t>
+        <w:t>Ses valeurs et les onglets des enregistrements liés.</w:t>
+      </w:r>
+    </w:p>
+    <w:p>
+      <w:r>
+        <w:rPr>
+          <w:b w:val="0"/>
+          <w:i w:val="0"/>
+        </w:rPr>
+        <w:t xml:space="preserve">Un clic sur un enregistrement ouvre sa </w:t>
+      </w:r>
+      <w:r>
+        <w:rPr>
+          <w:b/>
+          <w:i w:val="0"/>
+        </w:rPr>
+        <w:t>fiche</w:t>
+      </w:r>
+      <w:r>
+        <w:rPr>
+          <w:b w:val="0"/>
+          <w:i w:val="0"/>
+        </w:rPr>
+        <w:t xml:space="preserve"> (son résumé) :</w:t>
       </w:r>
     </w:p>
     <w:p>
@@ -3346,21 +3121,63 @@
           <w:b w:val="0"/>
           <w:i w:val="0"/>
         </w:rPr>
-        <w:t xml:space="preserve">Un astérisque </w:t>
+        <w:t xml:space="preserve">en haut, son nom, les boutons </w:t>
+      </w:r>
+      <w:r>
+        <w:rPr>
+          <w:b w:val="0"/>
+          <w:i/>
+        </w:rPr>
+        <w:t>Suivre</w:t>
+      </w:r>
+      <w:r>
+        <w:rPr>
+          <w:b w:val="0"/>
+          <w:i w:val="0"/>
+        </w:rPr>
+        <w:t xml:space="preserve">, </w:t>
+      </w:r>
+      <w:r>
+        <w:rPr>
+          <w:b w:val="0"/>
+          <w:i/>
+        </w:rPr>
+        <w:t>Modifier</w:t>
+      </w:r>
+      <w:r>
+        <w:rPr>
+          <w:b w:val="0"/>
+          <w:i w:val="0"/>
+        </w:rPr>
+        <w:t xml:space="preserve">, le menu </w:t>
       </w:r>
       <w:r>
         <w:rPr>
           <w:b/>
           <w:i w:val="0"/>
         </w:rPr>
-        <w:t>*</w:t>
-      </w:r>
-      <w:r>
-        <w:rPr>
-          <w:b w:val="0"/>
-          <w:i w:val="0"/>
-        </w:rPr>
-        <w:t xml:space="preserve"> signale un champ obligatoire. Les champs sont rangés en sections, parfois repliées ou en onglets.</w:t>
+        <w:t>⋯</w:t>
+      </w:r>
+      <w:r>
+        <w:rPr>
+          <w:b w:val="0"/>
+          <w:i w:val="0"/>
+        </w:rPr>
+        <w:t xml:space="preserve"> (</w:t>
+      </w:r>
+      <w:r>
+        <w:rPr>
+          <w:b w:val="0"/>
+          <w:i/>
+        </w:rPr>
+        <w:t>Plus d'actions</w:t>
+      </w:r>
+      <w:r>
+        <w:rPr>
+          <w:b w:val="0"/>
+          <w:i w:val="0"/>
+        </w:rPr>
+        <w:t>) et les actions propres à ce type d'enregistrement (changer un statut, par exemple) ;</w:t>
       </w:r>
     </w:p>
     <w:p>
@@ -3372,35 +3189,21 @@
           <w:b w:val="0"/>
           <w:i w:val="0"/>
         </w:rPr>
-        <w:t xml:space="preserve">Une liste de choix se recherche en tapant quelques lettres ; la croix la vide. À côté d'une liste qui désigne un autre enregistrement, le </w:t>
-      </w:r>
-      <w:r>
-        <w:rPr>
-          <w:b/>
-          <w:i w:val="0"/>
-        </w:rPr>
-        <w:t>crayon</w:t>
-      </w:r>
-      <w:r>
-        <w:rPr>
-          <w:b w:val="0"/>
-          <w:i w:val="0"/>
-        </w:rPr>
-        <w:t xml:space="preserve"> modifie celui qui est choisi et le </w:t>
-      </w:r>
-      <w:r>
-        <w:rPr>
-          <w:b/>
-          <w:i w:val="0"/>
-        </w:rPr>
-        <w:t>+</w:t>
-      </w:r>
-      <w:r>
-        <w:rPr>
-          <w:b w:val="0"/>
-          <w:i w:val="0"/>
-        </w:rPr>
-        <w:t xml:space="preserve"> en crée un nouveau, dans une petite fenêtre : il est sélectionné dès qu'il est enregistré, sans perdre ce qui a déjà été saisi.</w:t>
+        <w:t xml:space="preserve">une ligne indique qui l'a modifié en dernier, et quand, avec un lien </w:t>
+      </w:r>
+      <w:r>
+        <w:rPr>
+          <w:b w:val="0"/>
+          <w:i/>
+        </w:rPr>
+        <w:t>Voir l'historique</w:t>
+      </w:r>
+      <w:r>
+        <w:rPr>
+          <w:b w:val="0"/>
+          <w:i w:val="0"/>
+        </w:rPr>
+        <w:t xml:space="preserve"> ;</w:t>
       </w:r>
     </w:p>
     <w:p>
@@ -3412,49 +3215,21 @@
           <w:b w:val="0"/>
           <w:i w:val="0"/>
         </w:rPr>
-        <w:t xml:space="preserve">Un fichier : </w:t>
-      </w:r>
-      <w:r>
-        <w:rPr>
-          <w:b w:val="0"/>
-          <w:i/>
-        </w:rPr>
-        <w:t>Choisir un fichier</w:t>
-      </w:r>
-      <w:r>
-        <w:rPr>
-          <w:b w:val="0"/>
-          <w:i w:val="0"/>
-        </w:rPr>
-        <w:t xml:space="preserve">, ou </w:t>
-      </w:r>
-      <w:r>
-        <w:rPr>
-          <w:b w:val="0"/>
-          <w:i/>
-        </w:rPr>
-        <w:t>Remplacer</w:t>
-      </w:r>
-      <w:r>
-        <w:rPr>
-          <w:b w:val="0"/>
-          <w:i w:val="0"/>
-        </w:rPr>
-        <w:t xml:space="preserve"> et </w:t>
-      </w:r>
-      <w:r>
-        <w:rPr>
-          <w:b w:val="0"/>
-          <w:i/>
-        </w:rPr>
-        <w:t>Retirer</w:t>
-      </w:r>
-      <w:r>
-        <w:rPr>
-          <w:b w:val="0"/>
-          <w:i w:val="0"/>
-        </w:rPr>
-        <w:t xml:space="preserve"> pour un fichier déjà présent. Le changement n'a lieu qu'à l'enregistrement.</w:t>
+        <w:t xml:space="preserve">des </w:t>
+      </w:r>
+      <w:r>
+        <w:rPr>
+          <w:b/>
+          <w:i w:val="0"/>
+        </w:rPr>
+        <w:t>chiffres</w:t>
+      </w:r>
+      <w:r>
+        <w:rPr>
+          <w:b w:val="0"/>
+          <w:i w:val="0"/>
+        </w:rPr>
+        <w:t xml:space="preserve"> en tuiles et, parfois, des graphiques ;</w:t>
       </w:r>
     </w:p>
     <w:p>
@@ -3466,49 +3241,78 @@
           <w:b w:val="0"/>
           <w:i w:val="0"/>
         </w:rPr>
-        <w:t xml:space="preserve">Des lignes intégrées (des commentaires, des étapes…) se remplissent dans le formulaire même : </w:t>
+        <w:t>ses valeurs, rangées par sections que l'on peut replier ; un enregistrement lié est un lien vers sa propre fiche, un fichier joint se télécharge d'un clic ;</w:t>
+      </w:r>
+    </w:p>
+    <w:p>
+      <w:pPr>
+        <w:pStyle w:val="ListBullet"/>
+      </w:pPr>
+      <w:r>
+        <w:rPr>
+          <w:b w:val="0"/>
+          <w:i w:val="0"/>
+        </w:rPr>
+        <w:t xml:space="preserve">des </w:t>
+      </w:r>
+      <w:r>
+        <w:rPr>
+          <w:b/>
+          <w:i w:val="0"/>
+        </w:rPr>
+        <w:t>onglets</w:t>
+      </w:r>
+      <w:r>
+        <w:rPr>
+          <w:b w:val="0"/>
+          <w:i w:val="0"/>
+        </w:rPr>
+        <w:t xml:space="preserve">, un par type d'enregistrement lié (les tickets d'un client, les saisies de temps d'un ticket…), avec leur nombre. Chaque onglet est une liste complète : recherche, filtres, vues, export, actions. Son bouton </w:t>
       </w:r>
       <w:r>
         <w:rPr>
           <w:b w:val="0"/>
           <w:i/>
         </w:rPr>
-        <w:t>Ajouter un autre…</w:t>
-      </w:r>
-      <w:r>
-        <w:rPr>
-          <w:b w:val="0"/>
-          <w:i w:val="0"/>
-        </w:rPr>
-        <w:t xml:space="preserve"> ajoute une ligne, </w:t>
-      </w:r>
-      <w:r>
-        <w:rPr>
-          <w:b w:val="0"/>
-          <w:i/>
-        </w:rPr>
-        <w:t>Retirer</w:t>
-      </w:r>
-      <w:r>
-        <w:rPr>
-          <w:b w:val="0"/>
-          <w:i w:val="0"/>
-        </w:rPr>
-        <w:t xml:space="preserve"> enlève une ligne (et </w:t>
-      </w:r>
-      <w:r>
-        <w:rPr>
-          <w:b w:val="0"/>
-          <w:i/>
-        </w:rPr>
-        <w:t>Annuler</w:t>
-      </w:r>
-      <w:r>
-        <w:rPr>
-          <w:b w:val="0"/>
-          <w:i w:val="0"/>
-        </w:rPr>
-        <w:t xml:space="preserve"> la remet).</w:t>
+        <w:t>Ajouter</w:t>
+      </w:r>
+      <w:r>
+        <w:rPr>
+          <w:b w:val="0"/>
+          <w:i w:val="0"/>
+        </w:rPr>
+        <w:t xml:space="preserve"> crée un enregistrement déjà rattaché à la fiche. Quand les onglets ne tiennent pas sur la largeur, les derniers passent derrière un bouton </w:t>
+      </w:r>
+      <w:r>
+        <w:rPr>
+          <w:b/>
+          <w:i w:val="0"/>
+        </w:rPr>
+        <w:t>+N</w:t>
+      </w:r>
+      <w:r>
+        <w:rPr>
+          <w:b w:val="0"/>
+          <w:i w:val="0"/>
+        </w:rPr>
+        <w:t>.</w:t>
+      </w:r>
+    </w:p>
+    <w:p>
+      <w:r>
+        <w:rPr>
+          <w:b w:val="0"/>
+          <w:i w:val="0"/>
+        </w:rPr>
+        <w:t>La fiche se met à jour d'elle-même si quelqu'un modifie l'enregistrement pendant que vous la regardez.</w:t>
+      </w:r>
+    </w:p>
+    <w:p>
+      <w:pPr>
+        <w:pStyle w:val="Heading1"/>
+      </w:pPr>
+      <w:r>
+        <w:t>6. Créer, modifier, supprimer</w:t>
       </w:r>
     </w:p>
     <w:p>
@@ -3516,7 +3320,7 @@
         <w:pStyle w:val="Heading2"/>
       </w:pPr>
       <w:r>
-        <w:t>Enregistrer</w:t>
+        <w:t>Créer</w:t>
       </w:r>
     </w:p>
     <w:p>
@@ -3525,77 +3329,49 @@
           <w:b w:val="0"/>
           <w:i w:val="0"/>
         </w:rPr>
-        <w:t xml:space="preserve">En bas du formulaire : </w:t>
+        <w:t xml:space="preserve">Le bouton </w:t>
       </w:r>
       <w:r>
         <w:rPr>
           <w:b/>
           <w:i w:val="0"/>
         </w:rPr>
-        <w:t>Enregistrer</w:t>
-      </w:r>
-      <w:r>
-        <w:rPr>
-          <w:b w:val="0"/>
-          <w:i w:val="0"/>
-        </w:rPr>
-        <w:t xml:space="preserve"> (retour à la fiche), </w:t>
+        <w:t>Ajouter</w:t>
+      </w:r>
+      <w:r>
+        <w:rPr>
+          <w:b w:val="0"/>
+          <w:i w:val="0"/>
+        </w:rPr>
+        <w:t xml:space="preserve"> en haut d'une liste, un raccourci du tableau de bord, ou </w:t>
+      </w:r>
+      <w:r>
+        <w:rPr>
+          <w:b w:val="0"/>
+          <w:i/>
+        </w:rPr>
+        <w:t>Ajouter</w:t>
+      </w:r>
+      <w:r>
+        <w:rPr>
+          <w:b w:val="0"/>
+          <w:i w:val="0"/>
+        </w:rPr>
+        <w:t xml:space="preserve"> dans un onglet de fiche ouvrent un formulaire vide (dans le dernier cas, déjà rattaché à la fiche). Dans une vue calendrier, le </w:t>
       </w:r>
       <w:r>
         <w:rPr>
           <w:b/>
           <w:i w:val="0"/>
         </w:rPr>
-        <w:t>Enregistrer et continuer les modifications</w:t>
-      </w:r>
-      <w:r>
-        <w:rPr>
-          <w:b w:val="0"/>
-          <w:i w:val="0"/>
-        </w:rPr>
-        <w:t xml:space="preserve"> (on reste sur le formulaire), </w:t>
-      </w:r>
-      <w:r>
-        <w:rPr>
-          <w:b/>
-          <w:i w:val="0"/>
-        </w:rPr>
-        <w:t>Enregistrer et ajouter un autre</w:t>
-      </w:r>
-      <w:r>
-        <w:rPr>
-          <w:b w:val="0"/>
-          <w:i w:val="0"/>
-        </w:rPr>
-        <w:t xml:space="preserve"> (un formulaire vide s'ouvre) et </w:t>
-      </w:r>
-      <w:r>
-        <w:rPr>
-          <w:b w:val="0"/>
-          <w:i/>
-        </w:rPr>
-        <w:t>Annuler</w:t>
-      </w:r>
-      <w:r>
-        <w:rPr>
-          <w:b w:val="0"/>
-          <w:i w:val="0"/>
-        </w:rPr>
-        <w:t xml:space="preserve">. </w:t>
-      </w:r>
-      <w:r>
-        <w:rPr>
-          <w:b/>
-          <w:i w:val="0"/>
-        </w:rPr>
-        <w:t>Ctrl+S</w:t>
-      </w:r>
-      <w:r>
-        <w:rPr>
-          <w:b w:val="0"/>
-          <w:i w:val="0"/>
-        </w:rPr>
-        <w:t xml:space="preserve"> enregistre aussi. Une erreur s'affiche sous le champ concerné et rien n'est enregistré tant qu'elle n'est pas corrigée. Quitter la page avec des modifications non enregistrées demande une confirmation.</w:t>
+        <w:t>+</w:t>
+      </w:r>
+      <w:r>
+        <w:rPr>
+          <w:b w:val="0"/>
+          <w:i w:val="0"/>
+        </w:rPr>
+        <w:t xml:space="preserve"> d'un jour ouvre le formulaire avec cette date.</w:t>
       </w:r>
     </w:p>
     <w:p>
@@ -3603,66 +3379,7 @@
         <w:pStyle w:val="Heading2"/>
       </w:pPr>
       <w:r>
-        <w:t>Modifier</w:t>
-      </w:r>
-    </w:p>
-    <w:p>
-      <w:r>
-        <w:rPr>
-          <w:b w:val="0"/>
-          <w:i w:val="0"/>
-        </w:rPr>
-        <w:t xml:space="preserve">Le bouton </w:t>
-      </w:r>
-      <w:r>
-        <w:rPr>
-          <w:b/>
-          <w:i w:val="0"/>
-        </w:rPr>
-        <w:t>Modifier</w:t>
-      </w:r>
-      <w:r>
-        <w:rPr>
-          <w:b w:val="0"/>
-          <w:i w:val="0"/>
-        </w:rPr>
-        <w:t xml:space="preserve"> d'une fiche, ou </w:t>
-      </w:r>
-      <w:r>
-        <w:rPr>
-          <w:b w:val="0"/>
-          <w:i/>
-        </w:rPr>
-        <w:t>Modifier</w:t>
-      </w:r>
-      <w:r>
-        <w:rPr>
-          <w:b w:val="0"/>
-          <w:i w:val="0"/>
-        </w:rPr>
-        <w:t xml:space="preserve"> dans le menu d'une ligne, ouvre le même formulaire, rempli. Ses onglets donnent aussi accès à l'historique ; </w:t>
-      </w:r>
-      <w:r>
-        <w:rPr>
-          <w:b w:val="0"/>
-          <w:i/>
-        </w:rPr>
-        <w:t>Résumé</w:t>
-      </w:r>
-      <w:r>
-        <w:rPr>
-          <w:b w:val="0"/>
-          <w:i w:val="0"/>
-        </w:rPr>
-        <w:t xml:space="preserve"> revient à la fiche.</w:t>
-      </w:r>
-    </w:p>
-    <w:p>
-      <w:pPr>
-        <w:pStyle w:val="Heading2"/>
-      </w:pPr>
-      <w:r>
-        <w:t>Supprimer</w:t>
+        <w:t>Remplir un formulaire</w:t>
       </w:r>
     </w:p>
     <w:p>
@@ -3682,7 +3399,7 @@
               <a:graphicData uri="http://schemas.openxmlformats.org/drawingml/2006/picture">
                 <pic:pic>
                   <pic:nvPicPr>
-                    <pic:cNvPr id="0" name="17-suppression.png"/>
+                    <pic:cNvPr id="0" name="15-formulaire.png"/>
                     <pic:cNvPicPr/>
                   </pic:nvPicPr>
                   <pic:blipFill>
@@ -3715,115 +3432,335 @@
           <w:color w:val="555B66"/>
           <w:sz w:val="18"/>
         </w:rPr>
-        <w:t>Avant de supprimer : tout ce qui part avec l'enregistrement.</w:t>
-      </w:r>
-    </w:p>
-    <w:p>
-      <w:r>
-        <w:rPr>
-          <w:b/>
-          <w:i w:val="0"/>
-        </w:rPr>
-        <w:t>Supprimer</w:t>
-      </w:r>
-      <w:r>
-        <w:rPr>
-          <w:b w:val="0"/>
-          <w:i w:val="0"/>
-        </w:rPr>
-        <w:t xml:space="preserve"> se trouve en bas du formulaire, dans le menu d'une ligne, ou parmi les actions groupées. Avant de supprimer, une fenêtre montre </w:t>
-      </w:r>
-      <w:r>
-        <w:rPr>
-          <w:b/>
-          <w:i w:val="0"/>
-        </w:rPr>
-        <w:t>tout ce qui disparaîtra avec l'enregistrement</w:t>
-      </w:r>
-      <w:r>
-        <w:rPr>
-          <w:b w:val="0"/>
-          <w:i w:val="0"/>
-        </w:rPr>
-        <w:t xml:space="preserve"> (ses commentaires, ses lignes…) ; </w:t>
-      </w:r>
-      <w:r>
-        <w:rPr>
-          <w:b w:val="0"/>
-          <w:i/>
-        </w:rPr>
-        <w:t>Oui, supprimer</w:t>
-      </w:r>
-      <w:r>
-        <w:rPr>
-          <w:b w:val="0"/>
-          <w:i w:val="0"/>
-        </w:rPr>
-        <w:t xml:space="preserve"> confirme. Si d'autres enregistrements protégés en dépendent, la suppression est refusée et la fenêtre dit lesquels. Lorsque l'écran dispose d'une </w:t>
-      </w:r>
-      <w:r>
-        <w:rPr>
-          <w:b/>
-          <w:i w:val="0"/>
-        </w:rPr>
-        <w:t>corbeille</w:t>
-      </w:r>
-      <w:r>
-        <w:rPr>
-          <w:b w:val="0"/>
-          <w:i w:val="0"/>
-        </w:rPr>
-        <w:t>, l'enregistrement y est seulement déplacé (</w:t>
-      </w:r>
-      <w:r>
-        <w:rPr>
-          <w:b w:val="0"/>
-          <w:i/>
-        </w:rPr>
-        <w:t>Mettre à la corbeille</w:t>
-      </w:r>
-      <w:r>
-        <w:rPr>
-          <w:b w:val="0"/>
-          <w:i w:val="0"/>
-        </w:rPr>
-        <w:t xml:space="preserve">) : la page </w:t>
-      </w:r>
-      <w:r>
-        <w:rPr>
-          <w:b w:val="0"/>
-          <w:i/>
-        </w:rPr>
-        <w:t>Corbeille</w:t>
-      </w:r>
-      <w:r>
-        <w:rPr>
-          <w:b w:val="0"/>
-          <w:i w:val="0"/>
-        </w:rPr>
-        <w:t xml:space="preserve"> de la liste permet de le </w:t>
-      </w:r>
-      <w:r>
-        <w:rPr>
-          <w:b w:val="0"/>
-          <w:i/>
-        </w:rPr>
-        <w:t>Restaurer</w:t>
-      </w:r>
-      <w:r>
-        <w:rPr>
-          <w:b w:val="0"/>
-          <w:i w:val="0"/>
-        </w:rPr>
-        <w:t>.</w:t>
+        <w:t>Un formulaire et ses boutons d'enregistrement.</w:t>
       </w:r>
     </w:p>
     <w:p>
       <w:pPr>
-        <w:pStyle w:val="Heading1"/>
+        <w:pStyle w:val="ListBullet"/>
       </w:pPr>
       <w:r>
-        <w:t>7. L'historique</w:t>
+        <w:rPr>
+          <w:b w:val="0"/>
+          <w:i w:val="0"/>
+        </w:rPr>
+        <w:t xml:space="preserve">Un astérisque </w:t>
+      </w:r>
+      <w:r>
+        <w:rPr>
+          <w:b/>
+          <w:i w:val="0"/>
+        </w:rPr>
+        <w:t>*</w:t>
+      </w:r>
+      <w:r>
+        <w:rPr>
+          <w:b w:val="0"/>
+          <w:i w:val="0"/>
+        </w:rPr>
+        <w:t xml:space="preserve"> signale un champ obligatoire. Les champs sont rangés en sections, parfois repliées ou en onglets.</w:t>
+      </w:r>
+    </w:p>
+    <w:p>
+      <w:pPr>
+        <w:pStyle w:val="ListBullet"/>
+      </w:pPr>
+      <w:r>
+        <w:rPr>
+          <w:b w:val="0"/>
+          <w:i w:val="0"/>
+        </w:rPr>
+        <w:t xml:space="preserve">Une liste de choix se recherche en tapant quelques lettres ; la croix la vide. À côté d'une liste qui désigne un autre enregistrement, le </w:t>
+      </w:r>
+      <w:r>
+        <w:rPr>
+          <w:b/>
+          <w:i w:val="0"/>
+        </w:rPr>
+        <w:t>crayon</w:t>
+      </w:r>
+      <w:r>
+        <w:rPr>
+          <w:b w:val="0"/>
+          <w:i w:val="0"/>
+        </w:rPr>
+        <w:t xml:space="preserve"> modifie celui qui est choisi et le </w:t>
+      </w:r>
+      <w:r>
+        <w:rPr>
+          <w:b/>
+          <w:i w:val="0"/>
+        </w:rPr>
+        <w:t>+</w:t>
+      </w:r>
+      <w:r>
+        <w:rPr>
+          <w:b w:val="0"/>
+          <w:i w:val="0"/>
+        </w:rPr>
+        <w:t xml:space="preserve"> en crée un nouveau, dans une petite fenêtre : il est sélectionné dès qu'il est enregistré, sans perdre ce qui a déjà été saisi.</w:t>
+      </w:r>
+    </w:p>
+    <w:p>
+      <w:pPr>
+        <w:pStyle w:val="ListBullet"/>
+      </w:pPr>
+      <w:r>
+        <w:rPr>
+          <w:b w:val="0"/>
+          <w:i w:val="0"/>
+        </w:rPr>
+        <w:t xml:space="preserve">Un fichier : </w:t>
+      </w:r>
+      <w:r>
+        <w:rPr>
+          <w:b w:val="0"/>
+          <w:i/>
+        </w:rPr>
+        <w:t>Choisir un fichier</w:t>
+      </w:r>
+      <w:r>
+        <w:rPr>
+          <w:b w:val="0"/>
+          <w:i w:val="0"/>
+        </w:rPr>
+        <w:t xml:space="preserve">, ou </w:t>
+      </w:r>
+      <w:r>
+        <w:rPr>
+          <w:b w:val="0"/>
+          <w:i/>
+        </w:rPr>
+        <w:t>Remplacer</w:t>
+      </w:r>
+      <w:r>
+        <w:rPr>
+          <w:b w:val="0"/>
+          <w:i w:val="0"/>
+        </w:rPr>
+        <w:t xml:space="preserve"> et </w:t>
+      </w:r>
+      <w:r>
+        <w:rPr>
+          <w:b w:val="0"/>
+          <w:i/>
+        </w:rPr>
+        <w:t>Retirer</w:t>
+      </w:r>
+      <w:r>
+        <w:rPr>
+          <w:b w:val="0"/>
+          <w:i w:val="0"/>
+        </w:rPr>
+        <w:t xml:space="preserve"> pour un fichier déjà présent. Le changement n'a lieu qu'à l'enregistrement.</w:t>
+      </w:r>
+    </w:p>
+    <w:p>
+      <w:pPr>
+        <w:pStyle w:val="ListBullet"/>
+      </w:pPr>
+      <w:r>
+        <w:rPr>
+          <w:b w:val="0"/>
+          <w:i w:val="0"/>
+        </w:rPr>
+        <w:t xml:space="preserve">Des lignes intégrées (des commentaires, des étapes…) se remplissent dans le formulaire même : </w:t>
+      </w:r>
+      <w:r>
+        <w:rPr>
+          <w:b w:val="0"/>
+          <w:i/>
+        </w:rPr>
+        <w:t>Ajouter un autre…</w:t>
+      </w:r>
+      <w:r>
+        <w:rPr>
+          <w:b w:val="0"/>
+          <w:i w:val="0"/>
+        </w:rPr>
+        <w:t xml:space="preserve"> ajoute une ligne, </w:t>
+      </w:r>
+      <w:r>
+        <w:rPr>
+          <w:b w:val="0"/>
+          <w:i/>
+        </w:rPr>
+        <w:t>Retirer</w:t>
+      </w:r>
+      <w:r>
+        <w:rPr>
+          <w:b w:val="0"/>
+          <w:i w:val="0"/>
+        </w:rPr>
+        <w:t xml:space="preserve"> enlève une ligne (et </w:t>
+      </w:r>
+      <w:r>
+        <w:rPr>
+          <w:b w:val="0"/>
+          <w:i/>
+        </w:rPr>
+        <w:t>Annuler</w:t>
+      </w:r>
+      <w:r>
+        <w:rPr>
+          <w:b w:val="0"/>
+          <w:i w:val="0"/>
+        </w:rPr>
+        <w:t xml:space="preserve"> la remet).</w:t>
+      </w:r>
+    </w:p>
+    <w:p>
+      <w:pPr>
+        <w:pStyle w:val="Heading2"/>
+      </w:pPr>
+      <w:r>
+        <w:t>Enregistrer</w:t>
+      </w:r>
+    </w:p>
+    <w:p>
+      <w:r>
+        <w:rPr>
+          <w:b w:val="0"/>
+          <w:i w:val="0"/>
+        </w:rPr>
+        <w:t xml:space="preserve">En bas du formulaire : </w:t>
+      </w:r>
+      <w:r>
+        <w:rPr>
+          <w:b/>
+          <w:i w:val="0"/>
+        </w:rPr>
+        <w:t>Enregistrer</w:t>
+      </w:r>
+      <w:r>
+        <w:rPr>
+          <w:b w:val="0"/>
+          <w:i w:val="0"/>
+        </w:rPr>
+        <w:t xml:space="preserve"> (retour à la fiche), </w:t>
+      </w:r>
+      <w:r>
+        <w:rPr>
+          <w:b/>
+          <w:i w:val="0"/>
+        </w:rPr>
+        <w:t>Enregistrer et continuer les modifications</w:t>
+      </w:r>
+      <w:r>
+        <w:rPr>
+          <w:b w:val="0"/>
+          <w:i w:val="0"/>
+        </w:rPr>
+        <w:t xml:space="preserve"> (on reste sur le formulaire), </w:t>
+      </w:r>
+      <w:r>
+        <w:rPr>
+          <w:b/>
+          <w:i w:val="0"/>
+        </w:rPr>
+        <w:t>Enregistrer et ajouter un autre</w:t>
+      </w:r>
+      <w:r>
+        <w:rPr>
+          <w:b w:val="0"/>
+          <w:i w:val="0"/>
+        </w:rPr>
+        <w:t xml:space="preserve"> (un formulaire vide s'ouvre) et </w:t>
+      </w:r>
+      <w:r>
+        <w:rPr>
+          <w:b w:val="0"/>
+          <w:i/>
+        </w:rPr>
+        <w:t>Annuler</w:t>
+      </w:r>
+      <w:r>
+        <w:rPr>
+          <w:b w:val="0"/>
+          <w:i w:val="0"/>
+        </w:rPr>
+        <w:t xml:space="preserve">. </w:t>
+      </w:r>
+      <w:r>
+        <w:rPr>
+          <w:b/>
+          <w:i w:val="0"/>
+        </w:rPr>
+        <w:t>Ctrl+S</w:t>
+      </w:r>
+      <w:r>
+        <w:rPr>
+          <w:b w:val="0"/>
+          <w:i w:val="0"/>
+        </w:rPr>
+        <w:t xml:space="preserve"> enregistre aussi. Une erreur s'affiche sous le champ concerné et rien n'est enregistré tant qu'elle n'est pas corrigée. Quitter la page avec des modifications non enregistrées demande une confirmation.</w:t>
+      </w:r>
+    </w:p>
+    <w:p>
+      <w:pPr>
+        <w:pStyle w:val="Heading2"/>
+      </w:pPr>
+      <w:r>
+        <w:t>Modifier</w:t>
+      </w:r>
+    </w:p>
+    <w:p>
+      <w:r>
+        <w:rPr>
+          <w:b w:val="0"/>
+          <w:i w:val="0"/>
+        </w:rPr>
+        <w:t xml:space="preserve">Le bouton </w:t>
+      </w:r>
+      <w:r>
+        <w:rPr>
+          <w:b/>
+          <w:i w:val="0"/>
+        </w:rPr>
+        <w:t>Modifier</w:t>
+      </w:r>
+      <w:r>
+        <w:rPr>
+          <w:b w:val="0"/>
+          <w:i w:val="0"/>
+        </w:rPr>
+        <w:t xml:space="preserve"> d'une fiche, ou </w:t>
+      </w:r>
+      <w:r>
+        <w:rPr>
+          <w:b w:val="0"/>
+          <w:i/>
+        </w:rPr>
+        <w:t>Modifier</w:t>
+      </w:r>
+      <w:r>
+        <w:rPr>
+          <w:b w:val="0"/>
+          <w:i w:val="0"/>
+        </w:rPr>
+        <w:t xml:space="preserve"> dans le menu d'une ligne, ouvre le même formulaire, rempli. Ses onglets donnent aussi accès à l'historique ; </w:t>
+      </w:r>
+      <w:r>
+        <w:rPr>
+          <w:b w:val="0"/>
+          <w:i/>
+        </w:rPr>
+        <w:t>Résumé</w:t>
+      </w:r>
+      <w:r>
+        <w:rPr>
+          <w:b w:val="0"/>
+          <w:i w:val="0"/>
+        </w:rPr>
+        <w:t xml:space="preserve"> revient à la fiche.</w:t>
+      </w:r>
+    </w:p>
+    <w:p>
+      <w:pPr>
+        <w:pStyle w:val="Heading2"/>
+      </w:pPr>
+      <w:r>
+        <w:t>Supprimer</w:t>
       </w:r>
     </w:p>
     <w:p>
@@ -3843,7 +3780,7 @@
               <a:graphicData uri="http://schemas.openxmlformats.org/drawingml/2006/picture">
                 <pic:pic>
                   <pic:nvPicPr>
-                    <pic:cNvPr id="0" name="14-historique.png"/>
+                    <pic:cNvPr id="0" name="17-suppression.png"/>
                     <pic:cNvPicPr/>
                   </pic:nvPicPr>
                   <pic:blipFill>
@@ -3876,72 +3813,107 @@
           <w:color w:val="555B66"/>
           <w:sz w:val="18"/>
         </w:rPr>
-        <w:t>L'onglet Historique : chaque modification, avant et après.</w:t>
+        <w:t>Avant de supprimer : tout ce qui part avec l'enregistrement.</w:t>
       </w:r>
     </w:p>
     <w:p>
       <w:r>
         <w:rPr>
-          <w:b w:val="0"/>
-          <w:i w:val="0"/>
-        </w:rPr>
-        <w:t xml:space="preserve">Chaque modification est conservée. L'onglet </w:t>
-      </w:r>
-      <w:r>
-        <w:rPr>
           <w:b/>
           <w:i w:val="0"/>
         </w:rPr>
-        <w:t>Historique</w:t>
-      </w:r>
-      <w:r>
-        <w:rPr>
-          <w:b w:val="0"/>
-          <w:i w:val="0"/>
-        </w:rPr>
-        <w:t xml:space="preserve"> d'une fiche (ou le lien </w:t>
+        <w:t>Supprimer</w:t>
+      </w:r>
+      <w:r>
+        <w:rPr>
+          <w:b w:val="0"/>
+          <w:i w:val="0"/>
+        </w:rPr>
+        <w:t xml:space="preserve"> se trouve en bas du formulaire, dans le menu d'une ligne, ou parmi les actions groupées. Avant de supprimer, une fenêtre montre </w:t>
+      </w:r>
+      <w:r>
+        <w:rPr>
+          <w:b/>
+          <w:i w:val="0"/>
+        </w:rPr>
+        <w:t>tout ce qui disparaîtra avec l'enregistrement</w:t>
+      </w:r>
+      <w:r>
+        <w:rPr>
+          <w:b w:val="0"/>
+          <w:i w:val="0"/>
+        </w:rPr>
+        <w:t xml:space="preserve"> (ses commentaires, ses lignes…) ; </w:t>
       </w:r>
       <w:r>
         <w:rPr>
           <w:b w:val="0"/>
           <w:i/>
         </w:rPr>
-        <w:t>Voir l'historique</w:t>
-      </w:r>
-      <w:r>
-        <w:rPr>
-          <w:b w:val="0"/>
-          <w:i w:val="0"/>
-        </w:rPr>
-        <w:t xml:space="preserve">) liste les versions, de la plus récente à la plus ancienne : qui, quand, et chaque valeur avant → après. </w:t>
+        <w:t>Oui, supprimer</w:t>
+      </w:r>
+      <w:r>
+        <w:rPr>
+          <w:b w:val="0"/>
+          <w:i w:val="0"/>
+        </w:rPr>
+        <w:t xml:space="preserve"> confirme. Si d'autres enregistrements protégés en dépendent, la suppression est refusée et la fenêtre dit lesquels. Lorsque l'écran dispose d'une </w:t>
+      </w:r>
+      <w:r>
+        <w:rPr>
+          <w:b/>
+          <w:i w:val="0"/>
+        </w:rPr>
+        <w:t>corbeille</w:t>
+      </w:r>
+      <w:r>
+        <w:rPr>
+          <w:b w:val="0"/>
+          <w:i w:val="0"/>
+        </w:rPr>
+        <w:t>, l'enregistrement y est seulement déplacé (</w:t>
       </w:r>
       <w:r>
         <w:rPr>
           <w:b w:val="0"/>
           <w:i/>
         </w:rPr>
-        <w:t>Voir cette version en entier</w:t>
-      </w:r>
-      <w:r>
-        <w:rPr>
-          <w:b w:val="0"/>
-          <w:i w:val="0"/>
-        </w:rPr>
-        <w:t xml:space="preserve"> montre l'enregistrement tel qu'il était à ce moment. La page </w:t>
+        <w:t>Mettre à la corbeille</w:t>
+      </w:r>
+      <w:r>
+        <w:rPr>
+          <w:b w:val="0"/>
+          <w:i w:val="0"/>
+        </w:rPr>
+        <w:t xml:space="preserve">) : la page </w:t>
       </w:r>
       <w:r>
         <w:rPr>
           <w:b w:val="0"/>
           <w:i/>
         </w:rPr>
-        <w:t>Modifications</w:t>
-      </w:r>
-      <w:r>
-        <w:rPr>
-          <w:b w:val="0"/>
-          <w:i w:val="0"/>
-        </w:rPr>
-        <w:t>, lorsqu'elle vous est ouverte, liste toutes les modifications de toute l'application, avec les filtres et les exports habituels.</w:t>
+        <w:t>Corbeille</w:t>
+      </w:r>
+      <w:r>
+        <w:rPr>
+          <w:b w:val="0"/>
+          <w:i w:val="0"/>
+        </w:rPr>
+        <w:t xml:space="preserve"> de la liste permet de le </w:t>
+      </w:r>
+      <w:r>
+        <w:rPr>
+          <w:b w:val="0"/>
+          <w:i/>
+        </w:rPr>
+        <w:t>Restaurer</w:t>
+      </w:r>
+      <w:r>
+        <w:rPr>
+          <w:b w:val="0"/>
+          <w:i w:val="0"/>
+        </w:rPr>
+        <w:t>.</w:t>
       </w:r>
     </w:p>
     <w:p>
@@ -3949,157 +3921,7 @@
         <w:pStyle w:val="Heading1"/>
       </w:pPr>
       <w:r>
-        <w:t>8. Importer depuis un tableur</w:t>
-      </w:r>
-    </w:p>
-    <w:p>
-      <w:r>
-        <w:rPr>
-          <w:b w:val="0"/>
-          <w:i w:val="0"/>
-        </w:rPr>
-        <w:t xml:space="preserve">Lorsqu'une liste propose </w:t>
-      </w:r>
-      <w:r>
-        <w:rPr>
-          <w:b/>
-          <w:i w:val="0"/>
-        </w:rPr>
-        <w:t>Importer</w:t>
-      </w:r>
-      <w:r>
-        <w:rPr>
-          <w:b w:val="0"/>
-          <w:i w:val="0"/>
-        </w:rPr>
-        <w:t xml:space="preserve"> :</w:t>
-      </w:r>
-    </w:p>
-    <w:p>
-      <w:pPr>
-        <w:ind w:left="539" w:hanging="283"/>
-      </w:pPr>
-      <w:r>
-        <w:rPr>
-          <w:b/>
-          <w:i w:val="0"/>
-        </w:rPr>
-        <w:t xml:space="preserve">1. </w:t>
-      </w:r>
-      <w:r>
-        <w:rPr>
-          <w:b w:val="0"/>
-          <w:i w:val="0"/>
-        </w:rPr>
-        <w:t xml:space="preserve">choisissez ou déposez un fichier Excel ou CSV ; </w:t>
-      </w:r>
-      <w:r>
-        <w:rPr>
-          <w:b w:val="0"/>
-          <w:i/>
-        </w:rPr>
-        <w:t>Télécharger un modèle</w:t>
-      </w:r>
-      <w:r>
-        <w:rPr>
-          <w:b w:val="0"/>
-          <w:i w:val="0"/>
-        </w:rPr>
-        <w:t xml:space="preserve"> fournit un classeur vide avec les bons en-têtes ;</w:t>
-      </w:r>
-    </w:p>
-    <w:p>
-      <w:pPr>
-        <w:ind w:left="539" w:hanging="283"/>
-      </w:pPr>
-      <w:r>
-        <w:rPr>
-          <w:b/>
-          <w:i w:val="0"/>
-        </w:rPr>
-        <w:t xml:space="preserve">2. </w:t>
-      </w:r>
-      <w:r>
-        <w:rPr>
-          <w:b w:val="0"/>
-          <w:i w:val="0"/>
-        </w:rPr>
-        <w:t>associez chaque colonne du fichier à un champ ;</w:t>
-      </w:r>
-    </w:p>
-    <w:p>
-      <w:pPr>
-        <w:ind w:left="539" w:hanging="283"/>
-      </w:pPr>
-      <w:r>
-        <w:rPr>
-          <w:b/>
-          <w:i w:val="0"/>
-        </w:rPr>
-        <w:t xml:space="preserve">3. </w:t>
-      </w:r>
-      <w:r>
-        <w:rPr>
-          <w:b w:val="0"/>
-          <w:i w:val="0"/>
-        </w:rPr>
-        <w:t>vérifiez l'</w:t>
-      </w:r>
-      <w:r>
-        <w:rPr>
-          <w:b w:val="0"/>
-          <w:i/>
-        </w:rPr>
-        <w:t>Aperçu</w:t>
-      </w:r>
-      <w:r>
-        <w:rPr>
-          <w:b w:val="0"/>
-          <w:i w:val="0"/>
-        </w:rPr>
-        <w:t xml:space="preserve"> : ce qui sera créé, mis à jour, inchangé, et les erreurs ligne par ligne ;</w:t>
-      </w:r>
-    </w:p>
-    <w:p>
-      <w:pPr>
-        <w:ind w:left="539" w:hanging="283"/>
-      </w:pPr>
-      <w:r>
-        <w:rPr>
-          <w:b/>
-          <w:i w:val="0"/>
-        </w:rPr>
-        <w:t xml:space="preserve">4. </w:t>
-      </w:r>
-      <w:r>
-        <w:rPr>
-          <w:b w:val="0"/>
-          <w:i/>
-        </w:rPr>
-        <w:t>Importer</w:t>
-      </w:r>
-      <w:r>
-        <w:rPr>
-          <w:b w:val="0"/>
-          <w:i w:val="0"/>
-        </w:rPr>
-        <w:t xml:space="preserve"> écrit tout, ou rien si une ligne est en erreur.</w:t>
-      </w:r>
-    </w:p>
-    <w:p>
-      <w:pPr>
-        <w:pStyle w:val="Heading1"/>
-      </w:pPr>
-      <w:r>
-        <w:t>9. Autres façons de voir les données</w:t>
-      </w:r>
-    </w:p>
-    <w:p>
-      <w:pPr>
-        <w:pStyle w:val="Heading2"/>
-      </w:pPr>
-      <w:r>
-        <w:t>Calendrier</w:t>
+        <w:t>7. L'historique</w:t>
       </w:r>
     </w:p>
     <w:p>
@@ -4119,7 +3941,7 @@
               <a:graphicData uri="http://schemas.openxmlformats.org/drawingml/2006/picture">
                 <pic:pic>
                   <pic:nvPicPr>
-                    <pic:cNvPr id="0" name="18-calendrier.png"/>
+                    <pic:cNvPr id="0" name="14-historique.png"/>
                     <pic:cNvPicPr/>
                   </pic:nvPicPr>
                   <pic:blipFill>
@@ -4152,7 +3974,7 @@
           <w:color w:val="555B66"/>
           <w:sz w:val="18"/>
         </w:rPr>
-        <w:t>Une vue calendrier, par mois.</w:t>
+        <w:t>L'onglet Historique : chaque modification, avant et après.</w:t>
       </w:r>
     </w:p>
     <w:p>
@@ -4161,91 +3983,213 @@
           <w:b w:val="0"/>
           <w:i w:val="0"/>
         </w:rPr>
-        <w:t xml:space="preserve">Certains enregistrements datés ont une vue </w:t>
+        <w:t xml:space="preserve">Chaque modification est conservée. L'onglet </w:t>
       </w:r>
       <w:r>
         <w:rPr>
           <w:b/>
           <w:i w:val="0"/>
         </w:rPr>
-        <w:t>calendrier</w:t>
-      </w:r>
-      <w:r>
-        <w:rPr>
-          <w:b w:val="0"/>
-          <w:i w:val="0"/>
-        </w:rPr>
-        <w:t xml:space="preserve"> (un bouton en haut de leur liste, ou une entrée de la navigation) : </w:t>
+        <w:t>Historique</w:t>
+      </w:r>
+      <w:r>
+        <w:rPr>
+          <w:b w:val="0"/>
+          <w:i w:val="0"/>
+        </w:rPr>
+        <w:t xml:space="preserve"> d'une fiche (ou le lien </w:t>
       </w:r>
       <w:r>
         <w:rPr>
           <w:b w:val="0"/>
           <w:i/>
         </w:rPr>
-        <w:t>Mois</w:t>
-      </w:r>
-      <w:r>
-        <w:rPr>
-          <w:b w:val="0"/>
-          <w:i w:val="0"/>
-        </w:rPr>
-        <w:t xml:space="preserve">, </w:t>
+        <w:t>Voir l'historique</w:t>
+      </w:r>
+      <w:r>
+        <w:rPr>
+          <w:b w:val="0"/>
+          <w:i w:val="0"/>
+        </w:rPr>
+        <w:t xml:space="preserve">) liste les versions, de la plus récente à la plus ancienne : qui, quand, et chaque valeur avant → après. </w:t>
       </w:r>
       <w:r>
         <w:rPr>
           <w:b w:val="0"/>
           <w:i/>
         </w:rPr>
-        <w:t>Semaine</w:t>
-      </w:r>
-      <w:r>
-        <w:rPr>
-          <w:b w:val="0"/>
-          <w:i w:val="0"/>
-        </w:rPr>
-        <w:t xml:space="preserve"> ou </w:t>
+        <w:t>Voir cette version en entier</w:t>
+      </w:r>
+      <w:r>
+        <w:rPr>
+          <w:b w:val="0"/>
+          <w:i w:val="0"/>
+        </w:rPr>
+        <w:t xml:space="preserve"> montre l'enregistrement tel qu'il était à ce moment. La page </w:t>
       </w:r>
       <w:r>
         <w:rPr>
           <w:b w:val="0"/>
           <w:i/>
         </w:rPr>
-        <w:t>Liste</w:t>
-      </w:r>
-      <w:r>
-        <w:rPr>
-          <w:b w:val="0"/>
-          <w:i w:val="0"/>
-        </w:rPr>
-        <w:t xml:space="preserve">, les flèches pour changer de période, </w:t>
+        <w:t>Modifications</w:t>
+      </w:r>
+      <w:r>
+        <w:rPr>
+          <w:b w:val="0"/>
+          <w:i w:val="0"/>
+        </w:rPr>
+        <w:t>, lorsqu'elle vous est ouverte, liste toutes les modifications de toute l'application, avec les filtres et les exports habituels.</w:t>
+      </w:r>
+    </w:p>
+    <w:p>
+      <w:pPr>
+        <w:pStyle w:val="Heading1"/>
+      </w:pPr>
+      <w:r>
+        <w:t>8. Importer depuis un tableur</w:t>
+      </w:r>
+    </w:p>
+    <w:p>
+      <w:r>
+        <w:rPr>
+          <w:b w:val="0"/>
+          <w:i w:val="0"/>
+        </w:rPr>
+        <w:t xml:space="preserve">Lorsqu'une liste propose </w:t>
+      </w:r>
+      <w:r>
+        <w:rPr>
+          <w:b/>
+          <w:i w:val="0"/>
+        </w:rPr>
+        <w:t>Importer</w:t>
+      </w:r>
+      <w:r>
+        <w:rPr>
+          <w:b w:val="0"/>
+          <w:i w:val="0"/>
+        </w:rPr>
+        <w:t xml:space="preserve"> :</w:t>
+      </w:r>
+    </w:p>
+    <w:p>
+      <w:pPr>
+        <w:ind w:left="539" w:hanging="283"/>
+      </w:pPr>
+      <w:r>
+        <w:rPr>
+          <w:b/>
+          <w:i w:val="0"/>
+        </w:rPr>
+        <w:t xml:space="preserve">1. </w:t>
+      </w:r>
+      <w:r>
+        <w:rPr>
+          <w:b w:val="0"/>
+          <w:i w:val="0"/>
+        </w:rPr>
+        <w:t xml:space="preserve">choisissez ou déposez un fichier Excel ou CSV ; </w:t>
       </w:r>
       <w:r>
         <w:rPr>
           <w:b w:val="0"/>
           <w:i/>
         </w:rPr>
-        <w:t>Aujourd'hui</w:t>
-      </w:r>
-      <w:r>
-        <w:rPr>
-          <w:b w:val="0"/>
-          <w:i w:val="0"/>
-        </w:rPr>
-        <w:t xml:space="preserve"> pour y revenir. La recherche et les filtres de la liste choisissent ce qui est affiché. Un enregistrement se </w:t>
-      </w:r>
+        <w:t>Télécharger un modèle</w:t>
+      </w:r>
+      <w:r>
+        <w:rPr>
+          <w:b w:val="0"/>
+          <w:i w:val="0"/>
+        </w:rPr>
+        <w:t xml:space="preserve"> fournit un classeur vide avec les bons en-têtes ;</w:t>
+      </w:r>
+    </w:p>
+    <w:p>
+      <w:pPr>
+        <w:ind w:left="539" w:hanging="283"/>
+      </w:pPr>
       <w:r>
         <w:rPr>
           <w:b/>
           <w:i w:val="0"/>
         </w:rPr>
-        <w:t>glisse</w:t>
-      </w:r>
-      <w:r>
-        <w:rPr>
-          <w:b w:val="0"/>
-          <w:i w:val="0"/>
-        </w:rPr>
-        <w:t xml:space="preserve"> sur un autre jour pour changer sa date, lorsque vous avez le droit de le modifier ; un clic l'ouvre.</w:t>
+        <w:t xml:space="preserve">2. </w:t>
+      </w:r>
+      <w:r>
+        <w:rPr>
+          <w:b w:val="0"/>
+          <w:i w:val="0"/>
+        </w:rPr>
+        <w:t>associez chaque colonne du fichier à un champ ;</w:t>
+      </w:r>
+    </w:p>
+    <w:p>
+      <w:pPr>
+        <w:ind w:left="539" w:hanging="283"/>
+      </w:pPr>
+      <w:r>
+        <w:rPr>
+          <w:b/>
+          <w:i w:val="0"/>
+        </w:rPr>
+        <w:t xml:space="preserve">3. </w:t>
+      </w:r>
+      <w:r>
+        <w:rPr>
+          <w:b w:val="0"/>
+          <w:i w:val="0"/>
+        </w:rPr>
+        <w:t>vérifiez l'</w:t>
+      </w:r>
+      <w:r>
+        <w:rPr>
+          <w:b w:val="0"/>
+          <w:i/>
+        </w:rPr>
+        <w:t>Aperçu</w:t>
+      </w:r>
+      <w:r>
+        <w:rPr>
+          <w:b w:val="0"/>
+          <w:i w:val="0"/>
+        </w:rPr>
+        <w:t xml:space="preserve"> : ce qui sera créé, mis à jour, inchangé, et les erreurs ligne par ligne ;</w:t>
+      </w:r>
+    </w:p>
+    <w:p>
+      <w:pPr>
+        <w:ind w:left="539" w:hanging="283"/>
+      </w:pPr>
+      <w:r>
+        <w:rPr>
+          <w:b/>
+          <w:i w:val="0"/>
+        </w:rPr>
+        <w:t xml:space="preserve">4. </w:t>
+      </w:r>
+      <w:r>
+        <w:rPr>
+          <w:b w:val="0"/>
+          <w:i/>
+        </w:rPr>
+        <w:t>Importer</w:t>
+      </w:r>
+      <w:r>
+        <w:rPr>
+          <w:b w:val="0"/>
+          <w:i w:val="0"/>
+        </w:rPr>
+        <w:t xml:space="preserve"> écrit tout, ou rien si une ligne est en erreur.</w:t>
+      </w:r>
+    </w:p>
+    <w:p>
+      <w:pPr>
+        <w:pStyle w:val="Heading1"/>
+      </w:pPr>
+      <w:r>
+        <w:t>9. Autres façons de voir les données</w:t>
       </w:r>
     </w:p>
     <w:p>
@@ -4253,7 +4197,7 @@
         <w:pStyle w:val="Heading2"/>
       </w:pPr>
       <w:r>
-        <w:t>Arborescence</w:t>
+        <w:t>Calendrier</w:t>
       </w:r>
     </w:p>
     <w:p>
@@ -4273,7 +4217,7 @@
               <a:graphicData uri="http://schemas.openxmlformats.org/drawingml/2006/picture">
                 <pic:pic>
                   <pic:nvPicPr>
-                    <pic:cNvPr id="0" name="19-arborescence.png"/>
+                    <pic:cNvPr id="0" name="18-calendrier.png"/>
                     <pic:cNvPicPr/>
                   </pic:nvPicPr>
                   <pic:blipFill>
@@ -4306,7 +4250,7 @@
           <w:color w:val="555B66"/>
           <w:sz w:val="18"/>
         </w:rPr>
-        <w:t>Une arborescence dépliée.</w:t>
+        <w:t>Une vue calendrier, par mois.</w:t>
       </w:r>
     </w:p>
     <w:p>
@@ -4315,57 +4259,99 @@
           <w:b w:val="0"/>
           <w:i w:val="0"/>
         </w:rPr>
-        <w:t xml:space="preserve">Les enregistrements qui en contiennent d'autres (une nomenclature, une hiérarchie) s'affichent en </w:t>
+        <w:t xml:space="preserve">Certains enregistrements datés ont une vue </w:t>
       </w:r>
       <w:r>
         <w:rPr>
           <w:b/>
           <w:i w:val="0"/>
         </w:rPr>
-        <w:t>arborescence</w:t>
-      </w:r>
-      <w:r>
-        <w:rPr>
-          <w:b w:val="0"/>
-          <w:i w:val="0"/>
-        </w:rPr>
-        <w:t xml:space="preserve"> : la flèche d'une ligne la déplie, le chiffre à côté du nom indique combien d'éléments elle contient. Au clavier : flèches haut et bas, droite pour déplier, gauche pour replier, Entrée pour ouvrir. </w:t>
+        <w:t>calendrier</w:t>
+      </w:r>
+      <w:r>
+        <w:rPr>
+          <w:b w:val="0"/>
+          <w:i w:val="0"/>
+        </w:rPr>
+        <w:t xml:space="preserve"> (un bouton en haut de leur liste, ou une entrée de la navigation) : </w:t>
       </w:r>
       <w:r>
         <w:rPr>
           <w:b w:val="0"/>
           <w:i/>
         </w:rPr>
-        <w:t>Tout replier</w:t>
-      </w:r>
-      <w:r>
-        <w:rPr>
-          <w:b w:val="0"/>
-          <w:i w:val="0"/>
-        </w:rPr>
-        <w:t xml:space="preserve"> et </w:t>
+        <w:t>Mois</w:t>
+      </w:r>
+      <w:r>
+        <w:rPr>
+          <w:b w:val="0"/>
+          <w:i w:val="0"/>
+        </w:rPr>
+        <w:t xml:space="preserve">, </w:t>
       </w:r>
       <w:r>
         <w:rPr>
           <w:b w:val="0"/>
           <w:i/>
         </w:rPr>
-        <w:t>Actualiser</w:t>
-      </w:r>
-      <w:r>
-        <w:rPr>
-          <w:b w:val="0"/>
-          <w:i w:val="0"/>
-        </w:rPr>
-        <w:t xml:space="preserve"> sont au-dessus ; la recherche cherche à tous les niveaux.</w:t>
+        <w:t>Semaine</w:t>
+      </w:r>
+      <w:r>
+        <w:rPr>
+          <w:b w:val="0"/>
+          <w:i w:val="0"/>
+        </w:rPr>
+        <w:t xml:space="preserve"> ou </w:t>
+      </w:r>
+      <w:r>
+        <w:rPr>
+          <w:b w:val="0"/>
+          <w:i/>
+        </w:rPr>
+        <w:t>Liste</w:t>
+      </w:r>
+      <w:r>
+        <w:rPr>
+          <w:b w:val="0"/>
+          <w:i w:val="0"/>
+        </w:rPr>
+        <w:t xml:space="preserve">, les flèches pour changer de période, </w:t>
+      </w:r>
+      <w:r>
+        <w:rPr>
+          <w:b w:val="0"/>
+          <w:i/>
+        </w:rPr>
+        <w:t>Aujourd'hui</w:t>
+      </w:r>
+      <w:r>
+        <w:rPr>
+          <w:b w:val="0"/>
+          <w:i w:val="0"/>
+        </w:rPr>
+        <w:t xml:space="preserve"> pour y revenir. La recherche et les filtres de la liste choisissent ce qui est affiché. Un enregistrement se </w:t>
+      </w:r>
+      <w:r>
+        <w:rPr>
+          <w:b/>
+          <w:i w:val="0"/>
+        </w:rPr>
+        <w:t>glisse</w:t>
+      </w:r>
+      <w:r>
+        <w:rPr>
+          <w:b w:val="0"/>
+          <w:i w:val="0"/>
+        </w:rPr>
+        <w:t xml:space="preserve"> sur un autre jour pour changer sa date, lorsque vous avez le droit de le modifier ; un clic l'ouvre.</w:t>
       </w:r>
     </w:p>
     <w:p>
       <w:pPr>
-        <w:pStyle w:val="Heading1"/>
+        <w:pStyle w:val="Heading2"/>
       </w:pPr>
       <w:r>
-        <w:t>10. Rester informé</w:t>
+        <w:t>Arborescence</w:t>
       </w:r>
     </w:p>
     <w:p>
@@ -4385,7 +4371,7 @@
               <a:graphicData uri="http://schemas.openxmlformats.org/drawingml/2006/picture">
                 <pic:pic>
                   <pic:nvPicPr>
-                    <pic:cNvPr id="0" name="22-notifications.png"/>
+                    <pic:cNvPr id="0" name="19-arborescence.png"/>
                     <pic:cNvPicPr/>
                   </pic:nvPicPr>
                   <pic:blipFill>
@@ -4418,113 +4404,58 @@
           <w:color w:val="555B66"/>
           <w:sz w:val="18"/>
         </w:rPr>
-        <w:t>Le menu de la cloche des notifications.</w:t>
+        <w:t>Une arborescence dépliée.</w:t>
       </w:r>
     </w:p>
     <w:p>
-      <w:pPr>
-        <w:pStyle w:val="ListBullet"/>
-      </w:pPr>
+      <w:r>
+        <w:rPr>
+          <w:b w:val="0"/>
+          <w:i w:val="0"/>
+        </w:rPr>
+        <w:t xml:space="preserve">Les enregistrements qui en contiennent d'autres (une nomenclature, une hiérarchie) s'affichent en </w:t>
+      </w:r>
       <w:r>
         <w:rPr>
           <w:b/>
           <w:i w:val="0"/>
         </w:rPr>
-        <w:t>Suivre</w:t>
-      </w:r>
-      <w:r>
-        <w:rPr>
-          <w:b w:val="0"/>
-          <w:i w:val="0"/>
-        </w:rPr>
-        <w:t xml:space="preserve"> : sur une fiche, ce bouton vous fait prévenir quand l'enregistrement change ; la flèche à côté propose aussi de suivre tous les enregistrements du même type. Sur une liste, </w:t>
+        <w:t>arborescence</w:t>
+      </w:r>
+      <w:r>
+        <w:rPr>
+          <w:b w:val="0"/>
+          <w:i w:val="0"/>
+        </w:rPr>
+        <w:t xml:space="preserve"> : la flèche d'une ligne la déplie, le chiffre à côté du nom indique combien d'éléments elle contient. Au clavier : flèches haut et bas, droite pour déplier, gauche pour replier, Entrée pour ouvrir. </w:t>
       </w:r>
       <w:r>
         <w:rPr>
           <w:b w:val="0"/>
           <w:i/>
         </w:rPr>
-        <w:t>Suivre tous les enregistrements</w:t>
-      </w:r>
-      <w:r>
-        <w:rPr>
-          <w:b w:val="0"/>
-          <w:i w:val="0"/>
-        </w:rPr>
-        <w:t xml:space="preserve"> fait de même.</w:t>
-      </w:r>
-    </w:p>
-    <w:p>
-      <w:pPr>
-        <w:pStyle w:val="ListBullet"/>
-      </w:pPr>
-      <w:r>
-        <w:rPr>
-          <w:b/>
-          <w:i w:val="0"/>
-        </w:rPr>
-        <w:t>Suivis</w:t>
-      </w:r>
-      <w:r>
-        <w:rPr>
-          <w:b w:val="0"/>
-          <w:i w:val="0"/>
-        </w:rPr>
-        <w:t>, dans le menu du compte, liste ce que vous suivez et règle, pour chacun, quels changements vous intéressent et comment vous en êtes prévenu.</w:t>
-      </w:r>
-    </w:p>
-    <w:p>
-      <w:pPr>
-        <w:pStyle w:val="ListBullet"/>
-      </w:pPr>
-      <w:r>
-        <w:rPr>
-          <w:b w:val="0"/>
-          <w:i w:val="0"/>
-        </w:rPr>
-        <w:t xml:space="preserve">La </w:t>
-      </w:r>
-      <w:r>
-        <w:rPr>
-          <w:b/>
-          <w:i w:val="0"/>
-        </w:rPr>
-        <w:t>cloche</w:t>
-      </w:r>
-      <w:r>
-        <w:rPr>
-          <w:b w:val="0"/>
-          <w:i w:val="0"/>
-        </w:rPr>
-        <w:t xml:space="preserve"> affiche le nombre de notifications non lues ; son menu montre les dernières, </w:t>
+        <w:t>Tout replier</w:t>
+      </w:r>
+      <w:r>
+        <w:rPr>
+          <w:b w:val="0"/>
+          <w:i w:val="0"/>
+        </w:rPr>
+        <w:t xml:space="preserve"> et </w:t>
       </w:r>
       <w:r>
         <w:rPr>
           <w:b w:val="0"/>
           <w:i/>
         </w:rPr>
-        <w:t>Tout marquer comme lu</w:t>
-      </w:r>
-      <w:r>
-        <w:rPr>
-          <w:b w:val="0"/>
-          <w:i w:val="0"/>
-        </w:rPr>
-        <w:t xml:space="preserve"> et </w:t>
-      </w:r>
-      <w:r>
-        <w:rPr>
-          <w:b w:val="0"/>
-          <w:i/>
-        </w:rPr>
-        <w:t>Voir toutes les notifications</w:t>
-      </w:r>
-      <w:r>
-        <w:rPr>
-          <w:b w:val="0"/>
-          <w:i w:val="0"/>
-        </w:rPr>
-        <w:t>. Une notification arrive aussi en bandeau sur la page ouverte, et par e-mail si vous l'avez choisi.</w:t>
+        <w:t>Actualiser</w:t>
+      </w:r>
+      <w:r>
+        <w:rPr>
+          <w:b w:val="0"/>
+          <w:i w:val="0"/>
+        </w:rPr>
+        <w:t xml:space="preserve"> sont au-dessus ; la recherche cherche à tous les niveaux.</w:t>
       </w:r>
     </w:p>
     <w:p>
@@ -4532,7 +4463,7 @@
         <w:pStyle w:val="Heading1"/>
       </w:pPr>
       <w:r>
-        <w:t>11. Le wiki</w:t>
+        <w:t>10. Rester informé</w:t>
       </w:r>
     </w:p>
     <w:p>
@@ -4552,7 +4483,7 @@
               <a:graphicData uri="http://schemas.openxmlformats.org/drawingml/2006/picture">
                 <pic:pic>
                   <pic:nvPicPr>
-                    <pic:cNvPr id="0" name="20-wiki.png"/>
+                    <pic:cNvPr id="0" name="22-notifications.png"/>
                     <pic:cNvPicPr/>
                   </pic:nvPicPr>
                   <pic:blipFill>
@@ -4585,58 +4516,7 @@
           <w:color w:val="555B66"/>
           <w:sz w:val="18"/>
         </w:rPr>
-        <w:t>Une page du wiki et son menu.</w:t>
-      </w:r>
-    </w:p>
-    <w:p>
-      <w:r>
-        <w:rPr>
-          <w:b w:val="0"/>
-          <w:i w:val="0"/>
-        </w:rPr>
-        <w:t xml:space="preserve">Le wiki rassemble la documentation écrite par l'équipe. </w:t>
-      </w:r>
-      <w:r>
-        <w:rPr>
-          <w:b/>
-          <w:i w:val="0"/>
-        </w:rPr>
-        <w:t>Wiki</w:t>
-      </w:r>
-      <w:r>
-        <w:rPr>
-          <w:b w:val="0"/>
-          <w:i w:val="0"/>
-        </w:rPr>
-        <w:t xml:space="preserve">, dans la navigation, liste les wikis ; </w:t>
-      </w:r>
-      <w:r>
-        <w:rPr>
-          <w:b w:val="0"/>
-          <w:i/>
-        </w:rPr>
-        <w:t>Ouvrir</w:t>
-      </w:r>
-      <w:r>
-        <w:rPr>
-          <w:b w:val="0"/>
-          <w:i w:val="0"/>
-        </w:rPr>
-        <w:t xml:space="preserve"> entre dans l'un d'eux, </w:t>
-      </w:r>
-      <w:r>
-        <w:rPr>
-          <w:b w:val="0"/>
-          <w:i/>
-        </w:rPr>
-        <w:t>PDF</w:t>
-      </w:r>
-      <w:r>
-        <w:rPr>
-          <w:b w:val="0"/>
-          <w:i w:val="0"/>
-        </w:rPr>
-        <w:t xml:space="preserve"> le télécharge en entier (portrait ou paysage).</w:t>
+        <w:t>Le menu de la cloche des notifications.</w:t>
       </w:r>
     </w:p>
     <w:p>
@@ -4645,10 +4525,31 @@
       </w:pPr>
       <w:r>
         <w:rPr>
-          <w:b w:val="0"/>
-          <w:i w:val="0"/>
-        </w:rPr>
-        <w:t>À gauche, le menu des pages, en arbre, avec une zone pour filtrer les pages ; les autres wikis sont dépliables sous son nom.</w:t>
+          <w:b/>
+          <w:i w:val="0"/>
+        </w:rPr>
+        <w:t>Suivre</w:t>
+      </w:r>
+      <w:r>
+        <w:rPr>
+          <w:b w:val="0"/>
+          <w:i w:val="0"/>
+        </w:rPr>
+        <w:t xml:space="preserve"> : sur une fiche, ce bouton vous fait prévenir quand l'enregistrement change ; la flèche à côté propose aussi de suivre tous les enregistrements du même type. Sur une liste, </w:t>
+      </w:r>
+      <w:r>
+        <w:rPr>
+          <w:b w:val="0"/>
+          <w:i/>
+        </w:rPr>
+        <w:t>Suivre tous les enregistrements</w:t>
+      </w:r>
+      <w:r>
+        <w:rPr>
+          <w:b w:val="0"/>
+          <w:i w:val="0"/>
+        </w:rPr>
+        <w:t xml:space="preserve"> fait de même.</w:t>
       </w:r>
     </w:p>
     <w:p>
@@ -4660,98 +4561,14 @@
           <w:b/>
           <w:i w:val="0"/>
         </w:rPr>
-        <w:t>Modifier</w:t>
-      </w:r>
-      <w:r>
-        <w:rPr>
-          <w:b w:val="0"/>
-          <w:i w:val="0"/>
-        </w:rPr>
-        <w:t xml:space="preserve"> ouvre l'éditeur : titres, gras, italique, couleur du texte (le </w:t>
-      </w:r>
-      <w:r>
-        <w:rPr>
-          <w:b/>
-          <w:i w:val="0"/>
-        </w:rPr>
-        <w:t>A</w:t>
-      </w:r>
-      <w:r>
-        <w:rPr>
-          <w:b w:val="0"/>
-          <w:i w:val="0"/>
-        </w:rPr>
-        <w:t xml:space="preserve"> de la barre), tailles (le menu à côté du style), images à gauche ou à droite du texte (cliquer sur l'image, puis le menu image ; plusieurs images seules sur une ligne s'en partagent la largeur), tableaux (le bouton tableau ou </w:t>
-      </w:r>
-      <w:r>
-        <w:rPr>
-          <w:b/>
-          <w:i w:val="0"/>
-        </w:rPr>
-        <w:t>Ctrl+Alt+T</w:t>
-      </w:r>
-      <w:r>
-        <w:rPr>
-          <w:b w:val="0"/>
-          <w:i w:val="0"/>
-        </w:rPr>
-        <w:t xml:space="preserve">, lignes et colonnes par le menu à côté ; un tableau copié depuis Excel ou Word peut être collé, cellules fusionnées comprises), listes, citations, code, liens, images et fichiers joints (par la barre d'outils, en les déposant ou en les collant). Les flèches de la barre, ou </w:t>
-      </w:r>
-      <w:r>
-        <w:rPr>
-          <w:b/>
-          <w:i w:val="0"/>
-        </w:rPr>
-        <w:t>Alt+Haut</w:t>
-      </w:r>
-      <w:r>
-        <w:rPr>
-          <w:b w:val="0"/>
-          <w:i w:val="0"/>
-        </w:rPr>
-        <w:t xml:space="preserve"> et </w:t>
-      </w:r>
-      <w:r>
-        <w:rPr>
-          <w:b/>
-          <w:i w:val="0"/>
-        </w:rPr>
-        <w:t>Alt+Bas</w:t>
-      </w:r>
-      <w:r>
-        <w:rPr>
-          <w:b w:val="0"/>
-          <w:i w:val="0"/>
-        </w:rPr>
-        <w:t xml:space="preserve">, déplacent la ligne en cours. Dans l'éditeur, on règle aussi la page parente, la position dans le menu et l'épinglage au tableau de bord. </w:t>
-      </w:r>
-      <w:r>
-        <w:rPr>
-          <w:b w:val="0"/>
-          <w:i/>
-        </w:rPr>
-        <w:t>Enregistrer</w:t>
-      </w:r>
-      <w:r>
-        <w:rPr>
-          <w:b w:val="0"/>
-          <w:i w:val="0"/>
-        </w:rPr>
-        <w:t xml:space="preserve"> ou </w:t>
-      </w:r>
-      <w:r>
-        <w:rPr>
-          <w:b w:val="0"/>
-          <w:i/>
-        </w:rPr>
-        <w:t>Annuler</w:t>
-      </w:r>
-      <w:r>
-        <w:rPr>
-          <w:b w:val="0"/>
-          <w:i w:val="0"/>
-        </w:rPr>
-        <w:t>.</w:t>
+        <w:t>Suivis</w:t>
+      </w:r>
+      <w:r>
+        <w:rPr>
+          <w:b w:val="0"/>
+          <w:i w:val="0"/>
+        </w:rPr>
+        <w:t>, dans le menu du compte, liste ce que vous suivez et règle, pour chacun, quels changements vous intéressent et comment vous en êtes prévenu.</w:t>
       </w:r>
     </w:p>
     <w:p>
@@ -4760,76 +4577,52 @@
       </w:pPr>
       <w:r>
         <w:rPr>
+          <w:b w:val="0"/>
+          <w:i w:val="0"/>
+        </w:rPr>
+        <w:t xml:space="preserve">La </w:t>
+      </w:r>
+      <w:r>
+        <w:rPr>
           <w:b/>
           <w:i w:val="0"/>
         </w:rPr>
-        <w:t>Sous-page</w:t>
-      </w:r>
-      <w:r>
-        <w:rPr>
-          <w:b w:val="0"/>
-          <w:i w:val="0"/>
-        </w:rPr>
-        <w:t xml:space="preserve"> crée une page rangée sous celle-ci ; le </w:t>
-      </w:r>
-      <w:r>
-        <w:rPr>
-          <w:b/>
-          <w:i w:val="0"/>
-        </w:rPr>
-        <w:t>+</w:t>
-      </w:r>
-      <w:r>
-        <w:rPr>
-          <w:b w:val="0"/>
-          <w:i w:val="0"/>
-        </w:rPr>
-        <w:t xml:space="preserve"> du menu crée une page.</w:t>
-      </w:r>
-    </w:p>
-    <w:p>
-      <w:pPr>
-        <w:pStyle w:val="ListBullet"/>
-      </w:pPr>
-      <w:r>
-        <w:rPr>
-          <w:b/>
-          <w:i w:val="0"/>
-        </w:rPr>
-        <w:t>Historique</w:t>
-      </w:r>
-      <w:r>
-        <w:rPr>
-          <w:b w:val="0"/>
-          <w:i w:val="0"/>
-        </w:rPr>
-        <w:t xml:space="preserve"> liste les versions précédentes ; </w:t>
+        <w:t>cloche</w:t>
+      </w:r>
+      <w:r>
+        <w:rPr>
+          <w:b w:val="0"/>
+          <w:i w:val="0"/>
+        </w:rPr>
+        <w:t xml:space="preserve"> affiche le nombre de notifications non lues ; son menu montre les dernières, </w:t>
       </w:r>
       <w:r>
         <w:rPr>
           <w:b w:val="0"/>
           <w:i/>
         </w:rPr>
-        <w:t>Restaurer</w:t>
-      </w:r>
-      <w:r>
-        <w:rPr>
-          <w:b w:val="0"/>
-          <w:i w:val="0"/>
-        </w:rPr>
-        <w:t xml:space="preserve"> en rétablit une (la version actuelle est gardée, on peut donc revenir en arrière).</w:t>
-      </w:r>
-    </w:p>
-    <w:p>
-      <w:pPr>
-        <w:pStyle w:val="ListBullet"/>
-      </w:pPr>
-      <w:r>
-        <w:rPr>
-          <w:b w:val="0"/>
-          <w:i w:val="0"/>
-        </w:rPr>
-        <w:t>Si quelqu'un a enregistré la page pendant que vous la modifiiez, votre enregistrement est refusé avec son nom, et votre texte reste dans l'éditeur pour être recopié.</w:t>
+        <w:t>Tout marquer comme lu</w:t>
+      </w:r>
+      <w:r>
+        <w:rPr>
+          <w:b w:val="0"/>
+          <w:i w:val="0"/>
+        </w:rPr>
+        <w:t xml:space="preserve"> et </w:t>
+      </w:r>
+      <w:r>
+        <w:rPr>
+          <w:b w:val="0"/>
+          <w:i/>
+        </w:rPr>
+        <w:t>Voir toutes les notifications</w:t>
+      </w:r>
+      <w:r>
+        <w:rPr>
+          <w:b w:val="0"/>
+          <w:i w:val="0"/>
+        </w:rPr>
+        <w:t>. Une notification arrive aussi en bandeau sur la page ouverte, et par e-mail si vous l'avez choisi.</w:t>
       </w:r>
     </w:p>
     <w:p>
@@ -4837,7 +4630,7 @@
         <w:pStyle w:val="Heading1"/>
       </w:pPr>
       <w:r>
-        <w:t>12. Votre compte</w:t>
+        <w:t>11. Le wiki</w:t>
       </w:r>
     </w:p>
     <w:p>
@@ -4857,11 +4650,316 @@
               <a:graphicData uri="http://schemas.openxmlformats.org/drawingml/2006/picture">
                 <pic:pic>
                   <pic:nvPicPr>
+                    <pic:cNvPr id="0" name="20-wiki.png"/>
+                    <pic:cNvPicPr/>
+                  </pic:nvPicPr>
+                  <pic:blipFill>
+                    <a:blip r:embed="rId31"/>
+                    <a:stretch>
+                      <a:fillRect/>
+                    </a:stretch>
+                  </pic:blipFill>
+                  <pic:spPr>
+                    <a:xfrm>
+                      <a:off x="0" y="0"/>
+                      <a:ext cx="5400000" cy="4285714"/>
+                    </a:xfrm>
+                    <a:prstGeom prst="rect"/>
+                  </pic:spPr>
+                </pic:pic>
+              </a:graphicData>
+            </a:graphic>
+          </wp:inline>
+        </w:drawing>
+      </w:r>
+    </w:p>
+    <w:p>
+      <w:pPr>
+        <w:jc w:val="center"/>
+      </w:pPr>
+      <w:r>
+        <w:rPr>
+          <w:i/>
+          <w:color w:val="555B66"/>
+          <w:sz w:val="18"/>
+        </w:rPr>
+        <w:t>Une page du wiki et son menu.</w:t>
+      </w:r>
+    </w:p>
+    <w:p>
+      <w:r>
+        <w:rPr>
+          <w:b w:val="0"/>
+          <w:i w:val="0"/>
+        </w:rPr>
+        <w:t xml:space="preserve">Le wiki rassemble la documentation écrite par l'équipe. </w:t>
+      </w:r>
+      <w:r>
+        <w:rPr>
+          <w:b/>
+          <w:i w:val="0"/>
+        </w:rPr>
+        <w:t>Wiki</w:t>
+      </w:r>
+      <w:r>
+        <w:rPr>
+          <w:b w:val="0"/>
+          <w:i w:val="0"/>
+        </w:rPr>
+        <w:t xml:space="preserve">, dans la navigation, liste les wikis ; </w:t>
+      </w:r>
+      <w:r>
+        <w:rPr>
+          <w:b w:val="0"/>
+          <w:i/>
+        </w:rPr>
+        <w:t>Ouvrir</w:t>
+      </w:r>
+      <w:r>
+        <w:rPr>
+          <w:b w:val="0"/>
+          <w:i w:val="0"/>
+        </w:rPr>
+        <w:t xml:space="preserve"> entre dans l'un d'eux, </w:t>
+      </w:r>
+      <w:r>
+        <w:rPr>
+          <w:b w:val="0"/>
+          <w:i/>
+        </w:rPr>
+        <w:t>PDF</w:t>
+      </w:r>
+      <w:r>
+        <w:rPr>
+          <w:b w:val="0"/>
+          <w:i w:val="0"/>
+        </w:rPr>
+        <w:t xml:space="preserve"> le télécharge en entier (portrait ou paysage).</w:t>
+      </w:r>
+    </w:p>
+    <w:p>
+      <w:pPr>
+        <w:pStyle w:val="ListBullet"/>
+      </w:pPr>
+      <w:r>
+        <w:rPr>
+          <w:b w:val="0"/>
+          <w:i w:val="0"/>
+        </w:rPr>
+        <w:t>À gauche, le menu des pages, en arbre, avec une zone pour filtrer les pages ; les autres wikis sont dépliables sous son nom.</w:t>
+      </w:r>
+    </w:p>
+    <w:p>
+      <w:pPr>
+        <w:pStyle w:val="ListBullet"/>
+      </w:pPr>
+      <w:r>
+        <w:rPr>
+          <w:b/>
+          <w:i w:val="0"/>
+        </w:rPr>
+        <w:t>Modifier</w:t>
+      </w:r>
+      <w:r>
+        <w:rPr>
+          <w:b w:val="0"/>
+          <w:i w:val="0"/>
+        </w:rPr>
+        <w:t xml:space="preserve"> ouvre l'éditeur : titres, gras, italique, couleur du texte (le </w:t>
+      </w:r>
+      <w:r>
+        <w:rPr>
+          <w:b/>
+          <w:i w:val="0"/>
+        </w:rPr>
+        <w:t>A</w:t>
+      </w:r>
+      <w:r>
+        <w:rPr>
+          <w:b w:val="0"/>
+          <w:i w:val="0"/>
+        </w:rPr>
+        <w:t xml:space="preserve"> de la barre), tailles (le menu à côté du style), images à gauche ou à droite du texte (cliquer sur l'image, puis le menu image ; plusieurs images seules sur une ligne s'en partagent la largeur), tableaux (le bouton tableau ou </w:t>
+      </w:r>
+      <w:r>
+        <w:rPr>
+          <w:b/>
+          <w:i w:val="0"/>
+        </w:rPr>
+        <w:t>Ctrl+Alt+T</w:t>
+      </w:r>
+      <w:r>
+        <w:rPr>
+          <w:b w:val="0"/>
+          <w:i w:val="0"/>
+        </w:rPr>
+        <w:t xml:space="preserve">, lignes et colonnes par le menu à côté ; un tableau copié depuis Excel ou Word peut être collé, cellules fusionnées comprises), listes, citations, code, liens, images et fichiers joints (par la barre d'outils, en les déposant ou en les collant). Les flèches de la barre, ou </w:t>
+      </w:r>
+      <w:r>
+        <w:rPr>
+          <w:b/>
+          <w:i w:val="0"/>
+        </w:rPr>
+        <w:t>Alt+Haut</w:t>
+      </w:r>
+      <w:r>
+        <w:rPr>
+          <w:b w:val="0"/>
+          <w:i w:val="0"/>
+        </w:rPr>
+        <w:t xml:space="preserve"> et </w:t>
+      </w:r>
+      <w:r>
+        <w:rPr>
+          <w:b/>
+          <w:i w:val="0"/>
+        </w:rPr>
+        <w:t>Alt+Bas</w:t>
+      </w:r>
+      <w:r>
+        <w:rPr>
+          <w:b w:val="0"/>
+          <w:i w:val="0"/>
+        </w:rPr>
+        <w:t xml:space="preserve">, déplacent la ligne en cours. Dans l'éditeur, on règle aussi la page parente, la position dans le menu et l'épinglage au tableau de bord. </w:t>
+      </w:r>
+      <w:r>
+        <w:rPr>
+          <w:b w:val="0"/>
+          <w:i/>
+        </w:rPr>
+        <w:t>Enregistrer</w:t>
+      </w:r>
+      <w:r>
+        <w:rPr>
+          <w:b w:val="0"/>
+          <w:i w:val="0"/>
+        </w:rPr>
+        <w:t xml:space="preserve"> ou </w:t>
+      </w:r>
+      <w:r>
+        <w:rPr>
+          <w:b w:val="0"/>
+          <w:i/>
+        </w:rPr>
+        <w:t>Annuler</w:t>
+      </w:r>
+      <w:r>
+        <w:rPr>
+          <w:b w:val="0"/>
+          <w:i w:val="0"/>
+        </w:rPr>
+        <w:t>.</w:t>
+      </w:r>
+    </w:p>
+    <w:p>
+      <w:pPr>
+        <w:pStyle w:val="ListBullet"/>
+      </w:pPr>
+      <w:r>
+        <w:rPr>
+          <w:b/>
+          <w:i w:val="0"/>
+        </w:rPr>
+        <w:t>Sous-page</w:t>
+      </w:r>
+      <w:r>
+        <w:rPr>
+          <w:b w:val="0"/>
+          <w:i w:val="0"/>
+        </w:rPr>
+        <w:t xml:space="preserve"> crée une page rangée sous celle-ci ; le </w:t>
+      </w:r>
+      <w:r>
+        <w:rPr>
+          <w:b/>
+          <w:i w:val="0"/>
+        </w:rPr>
+        <w:t>+</w:t>
+      </w:r>
+      <w:r>
+        <w:rPr>
+          <w:b w:val="0"/>
+          <w:i w:val="0"/>
+        </w:rPr>
+        <w:t xml:space="preserve"> du menu crée une page.</w:t>
+      </w:r>
+    </w:p>
+    <w:p>
+      <w:pPr>
+        <w:pStyle w:val="ListBullet"/>
+      </w:pPr>
+      <w:r>
+        <w:rPr>
+          <w:b/>
+          <w:i w:val="0"/>
+        </w:rPr>
+        <w:t>Historique</w:t>
+      </w:r>
+      <w:r>
+        <w:rPr>
+          <w:b w:val="0"/>
+          <w:i w:val="0"/>
+        </w:rPr>
+        <w:t xml:space="preserve"> liste les versions précédentes ; </w:t>
+      </w:r>
+      <w:r>
+        <w:rPr>
+          <w:b w:val="0"/>
+          <w:i/>
+        </w:rPr>
+        <w:t>Restaurer</w:t>
+      </w:r>
+      <w:r>
+        <w:rPr>
+          <w:b w:val="0"/>
+          <w:i w:val="0"/>
+        </w:rPr>
+        <w:t xml:space="preserve"> en rétablit une (la version actuelle est gardée, on peut donc revenir en arrière).</w:t>
+      </w:r>
+    </w:p>
+    <w:p>
+      <w:pPr>
+        <w:pStyle w:val="ListBullet"/>
+      </w:pPr>
+      <w:r>
+        <w:rPr>
+          <w:b w:val="0"/>
+          <w:i w:val="0"/>
+        </w:rPr>
+        <w:t>Si quelqu'un a enregistré la page pendant que vous la modifiiez, votre enregistrement est refusé avec son nom, et votre texte reste dans l'éditeur pour être recopié.</w:t>
+      </w:r>
+    </w:p>
+    <w:p>
+      <w:pPr>
+        <w:pStyle w:val="Heading1"/>
+      </w:pPr>
+      <w:r>
+        <w:t>12. Votre compte</w:t>
+      </w:r>
+    </w:p>
+    <w:p>
+      <w:pPr>
+        <w:keepNext/>
+        <w:jc w:val="center"/>
+      </w:pPr>
+      <w:r>
+        <w:drawing>
+          <wp:inline xmlns:a="http://schemas.openxmlformats.org/drawingml/2006/main" xmlns:pic="http://schemas.openxmlformats.org/drawingml/2006/picture">
+            <wp:extent cx="5400000" cy="4285714"/>
+            <wp:docPr id="23" name="Picture 23"/>
+            <wp:cNvGraphicFramePr>
+              <a:graphicFrameLocks noChangeAspect="1"/>
+            </wp:cNvGraphicFramePr>
+            <a:graphic>
+              <a:graphicData uri="http://schemas.openxmlformats.org/drawingml/2006/picture">
+                <pic:pic>
+                  <pic:nvPicPr>
                     <pic:cNvPr id="0" name="21-compte.png"/>
                     <pic:cNvPicPr/>
                   </pic:nvPicPr>
                   <pic:blipFill>
-                    <a:blip r:embed="rId31"/>
+                    <a:blip r:embed="rId32"/>
                     <a:stretch>
                       <a:fillRect/>
                     </a:stretch>

</xml_diff>

<commit_message>
Duplicate records and wikis, their values edited before the copy is written
A resource's duplicate = True or Duplicate(exclude=, related=, values=,
permission=) puts Duplicate on each record's page and row menu: the add
form filled with the record's values (field permissions apply; unique
fields and files left out) and a Copy with it section ticking which
many-to-many values, inline rows and declared relations come along.
Saved through the resource's own endpoint, the relations copied in the
same transaction. On by default for auto() resources.

Wiki pages (with their subpages) and whole wikis are duplicated too;
wiki_duplicated lets docmanager keep a team wiki's readers on the copy.

Co-Authored-By: Claude Opus 5.5 (1M context) <noreply@anthropic.com>
Claude-Session: https://claude.ai/code/session_01VAx6ySSdzNRq2KKEdyeGqH
</commit_message>
<xml_diff>
--- a/docs/user-guide/guide-utilisateur.docx
+++ b/docs/user-guide/guide-utilisateur.docx
@@ -3760,6 +3760,51 @@
         <w:pStyle w:val="Heading2"/>
       </w:pPr>
       <w:r>
+        <w:t>Dupliquer</w:t>
+      </w:r>
+    </w:p>
+    <w:p>
+      <w:r>
+        <w:rPr>
+          <w:b w:val="0"/>
+          <w:i w:val="0"/>
+        </w:rPr>
+        <w:t xml:space="preserve">Quand l'écran le propose, </w:t>
+      </w:r>
+      <w:r>
+        <w:rPr>
+          <w:b/>
+          <w:i w:val="0"/>
+        </w:rPr>
+        <w:t>Dupliquer</w:t>
+      </w:r>
+      <w:r>
+        <w:rPr>
+          <w:b w:val="0"/>
+          <w:i w:val="0"/>
+        </w:rPr>
+        <w:t xml:space="preserve"> sur une fiche, ou dans le menu d'une ligne, ouvre un nouveau formulaire déjà rempli avec les valeurs de l'enregistrement : changez ce qui diffère, puis enregistrez. Rien n'est écrit avant. Les champs qui doivent être uniques (une référence, un code) restent vides. Sous </w:t>
+      </w:r>
+      <w:r>
+        <w:rPr>
+          <w:b w:val="0"/>
+          <w:i/>
+        </w:rPr>
+        <w:t>Copier avec</w:t>
+      </w:r>
+      <w:r>
+        <w:rPr>
+          <w:b w:val="0"/>
+          <w:i w:val="0"/>
+        </w:rPr>
+        <w:t>, cochez ce qui accompagne la copie - ses étiquettes, ses lignes, ses composants - et décochez le reste.</w:t>
+      </w:r>
+    </w:p>
+    <w:p>
+      <w:pPr>
+        <w:pStyle w:val="Heading2"/>
+      </w:pPr>
+      <w:r>
         <w:t>Supprimer</w:t>
       </w:r>
     </w:p>
@@ -4883,6 +4928,25 @@
           <w:i w:val="0"/>
         </w:rPr>
         <w:t xml:space="preserve"> du menu crée une page.</w:t>
+      </w:r>
+    </w:p>
+    <w:p>
+      <w:pPr>
+        <w:pStyle w:val="ListBullet"/>
+      </w:pPr>
+      <w:r>
+        <w:rPr>
+          <w:b/>
+          <w:i w:val="0"/>
+        </w:rPr>
+        <w:t>Dupliquer</w:t>
+      </w:r>
+      <w:r>
+        <w:rPr>
+          <w:b w:val="0"/>
+          <w:i w:val="0"/>
+        </w:rPr>
+        <w:t xml:space="preserve"> copie la page à côté d'elle, sous le titre donné, avec ses sous-pages si vous les cochez ; la copie s'ouvre dans l'éditeur. Dans la liste des wikis, l'icône de copie d'un wiki le copie en entier.</w:t>
       </w:r>
     </w:p>
     <w:p>

</xml_diff>